<commit_message>
docs: reconcile Whumpo technical design with deployed test platform
</commit_message>
<xml_diff>
--- a/docs/whumpo_mvp_design.docx
+++ b/docs/whumpo_mvp_design.docx
@@ -7,12 +7,15 @@
         <w:pStyle w:val="Title"/>
       </w:pPr>
       <w:r>
+        <w:rPr>
+          <w:color w:val="000000"/>
+        </w:rPr>
         <w:t>Whumpo MVP technical design</w:t>
       </w:r>
     </w:p>
     <w:p>
       <w:r>
-        <w:t>Version 0.6  |  September 29 2026  |  Private test platform</w:t>
+        <w:t>Version 0.7  |  September 30 2026  |  Private test platform</w:t>
       </w:r>
     </w:p>
     <w:p>
@@ -30,6 +33,9 @@
         <w:pStyle w:val="Heading2"/>
       </w:pPr>
       <w:r>
+        <w:rPr>
+          <w:color w:val="000000"/>
+        </w:rPr>
         <w:t>Current operating decisions</w:t>
       </w:r>
     </w:p>
@@ -78,6 +84,9 @@
         <w:pStyle w:val="Heading2"/>
       </w:pPr>
       <w:r>
+        <w:rPr>
+          <w:color w:val="000000"/>
+        </w:rPr>
         <w:t>Meaning of status</w:t>
       </w:r>
     </w:p>
@@ -87,6 +96,14 @@
         <w:tblW w:type="auto" w:w="0"/>
         <w:tblLayout w:type="fixed"/>
         <w:tblLook w:firstColumn="1" w:firstRow="1" w:lastColumn="0" w:lastRow="0" w:noHBand="0" w:noVBand="1" w:val="04A0"/>
+        <w:tblBorders>
+          <w:top w:val="single" w:sz="4" w:color="D9D9D9"/>
+          <w:left w:val="single" w:sz="4" w:color="D9D9D9"/>
+          <w:bottom w:val="single" w:sz="4" w:color="D9D9D9"/>
+          <w:right w:val="single" w:sz="4" w:color="D9D9D9"/>
+          <w:insideH w:val="single" w:sz="4" w:color="D9D9D9"/>
+          <w:insideV w:val="single" w:sz="4" w:color="D9D9D9"/>
+        </w:tblBorders>
       </w:tblPr>
       <w:tblGrid>
         <w:gridCol w:w="1656"/>
@@ -100,13 +117,28 @@
         <w:tc>
           <w:tcPr>
             <w:tcW w:type="dxa" w:w="1656"/>
+            <w:vAlign w:val="center"/>
+            <w:shd w:fill="DDEBF7"/>
+            <w:tcMar>
+              <w:top w:w="70" w:type="dxa"/>
+              <w:bottom w:w="70" w:type="dxa"/>
+              <w:left w:w="70" w:type="dxa"/>
+              <w:right w:w="70" w:type="dxa"/>
+            </w:tcMar>
+            <w:tcBorders>
+              <w:top w:val="single" w:sz="4" w:color="D9D9D9"/>
+              <w:bottom w:val="single" w:sz="4" w:color="D9D9D9"/>
+              <w:left w:val="single" w:sz="4" w:color="D9D9D9"/>
+              <w:right w:val="single" w:sz="4" w:color="D9D9D9"/>
+            </w:tcBorders>
           </w:tcPr>
           <w:p>
             <w:pPr>
-              <w:spacing w:after="100"/>
+              <w:spacing w:after="40"/>
             </w:pPr>
             <w:r>
               <w:rPr>
+                <w:color w:val="000000"/>
                 <w:sz w:val="19"/>
               </w:rPr>
               <w:t>Label</w:t>
@@ -116,13 +148,28 @@
         <w:tc>
           <w:tcPr>
             <w:tcW w:type="dxa" w:w="8280"/>
+            <w:vAlign w:val="center"/>
+            <w:shd w:fill="DDEBF7"/>
+            <w:tcMar>
+              <w:top w:w="70" w:type="dxa"/>
+              <w:bottom w:w="70" w:type="dxa"/>
+              <w:left w:w="70" w:type="dxa"/>
+              <w:right w:w="70" w:type="dxa"/>
+            </w:tcMar>
+            <w:tcBorders>
+              <w:top w:val="single" w:sz="4" w:color="D9D9D9"/>
+              <w:bottom w:val="single" w:sz="4" w:color="D9D9D9"/>
+              <w:left w:val="single" w:sz="4" w:color="D9D9D9"/>
+              <w:right w:val="single" w:sz="4" w:color="D9D9D9"/>
+            </w:tcBorders>
           </w:tcPr>
           <w:p>
             <w:pPr>
-              <w:spacing w:after="100"/>
+              <w:spacing w:after="40"/>
             </w:pPr>
             <w:r>
               <w:rPr>
+                <w:color w:val="000000"/>
                 <w:sz w:val="19"/>
               </w:rPr>
               <w:t>Meaning</w:t>
@@ -137,13 +184,28 @@
         <w:tc>
           <w:tcPr>
             <w:tcW w:type="dxa" w:w="1656"/>
+            <w:vAlign w:val="center"/>
+            <w:shd w:fill="FFFFFF"/>
+            <w:tcMar>
+              <w:top w:w="70" w:type="dxa"/>
+              <w:bottom w:w="70" w:type="dxa"/>
+              <w:left w:w="70" w:type="dxa"/>
+              <w:right w:w="70" w:type="dxa"/>
+            </w:tcMar>
+            <w:tcBorders>
+              <w:top w:val="single" w:sz="4" w:color="D9D9D9"/>
+              <w:bottom w:val="single" w:sz="4" w:color="D9D9D9"/>
+              <w:left w:val="single" w:sz="4" w:color="D9D9D9"/>
+              <w:right w:val="single" w:sz="4" w:color="D9D9D9"/>
+            </w:tcBorders>
           </w:tcPr>
           <w:p>
             <w:pPr>
-              <w:spacing w:after="100"/>
+              <w:spacing w:after="40"/>
             </w:pPr>
             <w:r>
               <w:rPr>
+                <w:color w:val="000000"/>
                 <w:sz w:val="19"/>
               </w:rPr>
               <w:t>Deployed</w:t>
@@ -153,13 +215,28 @@
         <w:tc>
           <w:tcPr>
             <w:tcW w:type="dxa" w:w="8280"/>
+            <w:vAlign w:val="center"/>
+            <w:shd w:fill="FFFFFF"/>
+            <w:tcMar>
+              <w:top w:w="70" w:type="dxa"/>
+              <w:bottom w:w="70" w:type="dxa"/>
+              <w:left w:w="70" w:type="dxa"/>
+              <w:right w:w="70" w:type="dxa"/>
+            </w:tcMar>
+            <w:tcBorders>
+              <w:top w:val="single" w:sz="4" w:color="D9D9D9"/>
+              <w:bottom w:val="single" w:sz="4" w:color="D9D9D9"/>
+              <w:left w:val="single" w:sz="4" w:color="D9D9D9"/>
+              <w:right w:val="single" w:sz="4" w:color="D9D9D9"/>
+            </w:tcBorders>
           </w:tcPr>
           <w:p>
             <w:pPr>
-              <w:spacing w:after="100"/>
+              <w:spacing w:after="40"/>
             </w:pPr>
             <w:r>
               <w:rPr>
+                <w:color w:val="000000"/>
                 <w:sz w:val="19"/>
               </w:rPr>
               <w:t>Code or configuration is present in the test environment; this alone does not prove every customer journey.</w:t>
@@ -174,13 +251,28 @@
         <w:tc>
           <w:tcPr>
             <w:tcW w:type="dxa" w:w="1656"/>
+            <w:vAlign w:val="center"/>
+            <w:shd w:fill="FFFFFF"/>
+            <w:tcMar>
+              <w:top w:w="70" w:type="dxa"/>
+              <w:bottom w:w="70" w:type="dxa"/>
+              <w:left w:w="70" w:type="dxa"/>
+              <w:right w:w="70" w:type="dxa"/>
+            </w:tcMar>
+            <w:tcBorders>
+              <w:top w:val="single" w:sz="4" w:color="D9D9D9"/>
+              <w:bottom w:val="single" w:sz="4" w:color="D9D9D9"/>
+              <w:left w:val="single" w:sz="4" w:color="D9D9D9"/>
+              <w:right w:val="single" w:sz="4" w:color="D9D9D9"/>
+            </w:tcBorders>
           </w:tcPr>
           <w:p>
             <w:pPr>
-              <w:spacing w:after="100"/>
+              <w:spacing w:after="40"/>
             </w:pPr>
             <w:r>
               <w:rPr>
+                <w:color w:val="000000"/>
                 <w:sz w:val="19"/>
               </w:rPr>
               <w:t>Verified</w:t>
@@ -190,13 +282,28 @@
         <w:tc>
           <w:tcPr>
             <w:tcW w:type="dxa" w:w="8280"/>
+            <w:vAlign w:val="center"/>
+            <w:shd w:fill="FFFFFF"/>
+            <w:tcMar>
+              <w:top w:w="70" w:type="dxa"/>
+              <w:bottom w:w="70" w:type="dxa"/>
+              <w:left w:w="70" w:type="dxa"/>
+              <w:right w:w="70" w:type="dxa"/>
+            </w:tcMar>
+            <w:tcBorders>
+              <w:top w:val="single" w:sz="4" w:color="D9D9D9"/>
+              <w:bottom w:val="single" w:sz="4" w:color="D9D9D9"/>
+              <w:left w:val="single" w:sz="4" w:color="D9D9D9"/>
+              <w:right w:val="single" w:sz="4" w:color="D9D9D9"/>
+            </w:tcBorders>
           </w:tcPr>
           <w:p>
             <w:pPr>
-              <w:spacing w:after="100"/>
+              <w:spacing w:after="40"/>
             </w:pPr>
             <w:r>
               <w:rPr>
+                <w:color w:val="000000"/>
                 <w:sz w:val="19"/>
               </w:rPr>
               <w:t>The stated test or live observation passed within its explicit scope.</w:t>
@@ -211,13 +318,28 @@
         <w:tc>
           <w:tcPr>
             <w:tcW w:type="dxa" w:w="1656"/>
+            <w:vAlign w:val="center"/>
+            <w:shd w:fill="FFFFFF"/>
+            <w:tcMar>
+              <w:top w:w="70" w:type="dxa"/>
+              <w:bottom w:w="70" w:type="dxa"/>
+              <w:left w:w="70" w:type="dxa"/>
+              <w:right w:w="70" w:type="dxa"/>
+            </w:tcMar>
+            <w:tcBorders>
+              <w:top w:val="single" w:sz="4" w:color="D9D9D9"/>
+              <w:bottom w:val="single" w:sz="4" w:color="D9D9D9"/>
+              <w:left w:val="single" w:sz="4" w:color="D9D9D9"/>
+              <w:right w:val="single" w:sz="4" w:color="D9D9D9"/>
+            </w:tcBorders>
           </w:tcPr>
           <w:p>
             <w:pPr>
-              <w:spacing w:after="100"/>
+              <w:spacing w:after="40"/>
             </w:pPr>
             <w:r>
               <w:rPr>
+                <w:color w:val="000000"/>
                 <w:sz w:val="19"/>
               </w:rPr>
               <w:t>Setup gated</w:t>
@@ -227,13 +349,28 @@
         <w:tc>
           <w:tcPr>
             <w:tcW w:type="dxa" w:w="8280"/>
+            <w:vAlign w:val="center"/>
+            <w:shd w:fill="FFFFFF"/>
+            <w:tcMar>
+              <w:top w:w="70" w:type="dxa"/>
+              <w:bottom w:w="70" w:type="dxa"/>
+              <w:left w:w="70" w:type="dxa"/>
+              <w:right w:w="70" w:type="dxa"/>
+            </w:tcMar>
+            <w:tcBorders>
+              <w:top w:val="single" w:sz="4" w:color="D9D9D9"/>
+              <w:bottom w:val="single" w:sz="4" w:color="D9D9D9"/>
+              <w:left w:val="single" w:sz="4" w:color="D9D9D9"/>
+              <w:right w:val="single" w:sz="4" w:color="D9D9D9"/>
+            </w:tcBorders>
           </w:tcPr>
           <w:p>
             <w:pPr>
-              <w:spacing w:after="100"/>
+              <w:spacing w:after="40"/>
             </w:pPr>
             <w:r>
               <w:rPr>
+                <w:color w:val="000000"/>
                 <w:sz w:val="19"/>
               </w:rPr>
               <w:t>Implementation exists, but credentials, resources or real provider consent are missing.</w:t>
@@ -248,13 +385,28 @@
         <w:tc>
           <w:tcPr>
             <w:tcW w:type="dxa" w:w="1656"/>
+            <w:vAlign w:val="center"/>
+            <w:shd w:fill="FFFFFF"/>
+            <w:tcMar>
+              <w:top w:w="70" w:type="dxa"/>
+              <w:bottom w:w="70" w:type="dxa"/>
+              <w:left w:w="70" w:type="dxa"/>
+              <w:right w:w="70" w:type="dxa"/>
+            </w:tcMar>
+            <w:tcBorders>
+              <w:top w:val="single" w:sz="4" w:color="D9D9D9"/>
+              <w:bottom w:val="single" w:sz="4" w:color="D9D9D9"/>
+              <w:left w:val="single" w:sz="4" w:color="D9D9D9"/>
+              <w:right w:val="single" w:sz="4" w:color="D9D9D9"/>
+            </w:tcBorders>
           </w:tcPr>
           <w:p>
             <w:pPr>
-              <w:spacing w:after="100"/>
+              <w:spacing w:after="40"/>
             </w:pPr>
             <w:r>
               <w:rPr>
+                <w:color w:val="000000"/>
                 <w:sz w:val="19"/>
               </w:rPr>
               <w:t>Planned</w:t>
@@ -264,13 +416,28 @@
         <w:tc>
           <w:tcPr>
             <w:tcW w:type="dxa" w:w="8280"/>
+            <w:vAlign w:val="center"/>
+            <w:shd w:fill="FFFFFF"/>
+            <w:tcMar>
+              <w:top w:w="70" w:type="dxa"/>
+              <w:bottom w:w="70" w:type="dxa"/>
+              <w:left w:w="70" w:type="dxa"/>
+              <w:right w:w="70" w:type="dxa"/>
+            </w:tcMar>
+            <w:tcBorders>
+              <w:top w:val="single" w:sz="4" w:color="D9D9D9"/>
+              <w:bottom w:val="single" w:sz="4" w:color="D9D9D9"/>
+              <w:left w:val="single" w:sz="4" w:color="D9D9D9"/>
+              <w:right w:val="single" w:sz="4" w:color="D9D9D9"/>
+            </w:tcBorders>
           </w:tcPr>
           <w:p>
             <w:pPr>
-              <w:spacing w:after="100"/>
+              <w:spacing w:after="40"/>
             </w:pPr>
             <w:r>
               <w:rPr>
+                <w:color w:val="000000"/>
                 <w:sz w:val="19"/>
               </w:rPr>
               <w:t>Product intent or a foundation that has not been activated end to end.</w:t>
@@ -292,9 +459,14 @@
     <w:p>
       <w:pPr>
         <w:pStyle w:val="Heading1"/>
+        <w:keepNext/>
         <w:pageBreakBefore/>
+        <w:spacing w:before="360"/>
       </w:pPr>
       <w:r>
+        <w:rPr>
+          <w:color w:val="000000"/>
+        </w:rPr>
         <w:t>Customer entry and workspace</w:t>
       </w:r>
     </w:p>
@@ -303,17 +475,20 @@
         <w:pStyle w:val="Heading2"/>
       </w:pPr>
       <w:r>
+        <w:rPr>
+          <w:color w:val="000000"/>
+        </w:rPr>
         <w:t>Welcome before the workspace</w:t>
       </w:r>
     </w:p>
     <w:p>
       <w:r>
-        <w:t>The welcome is a three-step guided conversation. First, collect a required name, optional bio, and a choice of six default avatars or an uploaded photo. Name and bio enter agent context only after explicit opt-in. Photos and email are excluded. Uploaded pictures are privately served, cropped to a square, and bounded before storage.</w:t>
+        <w:t>The guided welcome asks one question at a time in Whumpo message bubbles: name, picture, optional bio, first idea, working name, optional audience, starting style, then review. Three progress chapters organize the questions. Customers can inspect and revise earlier answers or skip optional ones. The interface identifies guided mode and uses no simulated inference or artificial typing delay. Six default avatars and private photo upload remain available in Profile.</w:t>
       </w:r>
     </w:p>
     <w:p>
       <w:r>
-        <w:t>Next, ask what the first project should do, its working name, optional audience, and an initial visual theme. Save each completed step and resume after refresh. Finally, show a review and start the private project. Project creation, workspace readiness, the Chat receipt and activity event commit atomically. Retrying after a lost response cannot create another project.</w:t>
+        <w:t>Save each continued answer with its question checkpoint and revision; refresh or another device resumes that question. Name and bio enter model context only after explicit opt-in; email and photo do not. Review the full brief before starting. Project creation, workspace readiness, the Chat receipt and activity event commit atomically. Same-request recovery cannot create a second project. Old clients fall back to the saved chapter when a checkpoint is absent or inconsistent.</w:t>
       </w:r>
     </w:p>
     <w:p>
@@ -326,6 +501,9 @@
         <w:pStyle w:val="Heading2"/>
       </w:pPr>
       <w:r>
+        <w:rPr>
+          <w:color w:val="000000"/>
+        </w:rPr>
         <w:t>Chat as the primary workspace</w:t>
       </w:r>
     </w:p>
@@ -344,6 +522,9 @@
         <w:pStyle w:val="Heading2"/>
       </w:pPr>
       <w:r>
+        <w:rPr>
+          <w:color w:val="000000"/>
+        </w:rPr>
         <w:t>Identity and recovery</w:t>
       </w:r>
     </w:p>
@@ -362,20 +543,28 @@
         <w:pStyle w:val="Heading2"/>
       </w:pPr>
       <w:r>
+        <w:rPr>
+          <w:color w:val="000000"/>
+        </w:rPr>
         <w:t>Verified handoff</w:t>
       </w:r>
     </w:p>
     <w:p>
       <w:r>
-        <w:t>A live Muse probe used disposable local customer state after welcome. “Let’s build it” reused the existing project, retained its theme and saved one private draft without repeating the brief. Full project descriptions are bounded at 1,000 characters. An unshared bio marker stayed out of provider context. Exact replay caused no extra call, charge or version.</w:t>
+        <w:t>Chat offers Build my first draft for the original welcome project, using its complete saved brief even when newer projects displace it from the usual context window. One model call may propose a private preview for that exact project or ask a clarification. An atomic claim prevents a duplicate first version during retries, competing builds or project deletion. A real Muse probe against disposable local state created one draft in one call, spent 9 test units, retained details beyond character 240 and excluded an unshared bio. Replay made no extra call. A 390px browser journey verified the result and reload; physical touch remains unverified.</w:t>
       </w:r>
     </w:p>
     <w:p>
       <w:pPr>
         <w:pStyle w:val="Heading1"/>
-        <w:pageBreakBefore/>
+        <w:keepNext/>
+        <w:pageBreakBefore w:val="0"/>
+        <w:spacing w:before="360"/>
       </w:pPr>
       <w:r>
+        <w:rPr>
+          <w:color w:val="000000"/>
+        </w:rPr>
         <w:t>Architecture and trust boundaries</w:t>
       </w:r>
     </w:p>
@@ -390,6 +579,14 @@
         <w:tblW w:type="auto" w:w="0"/>
         <w:tblLayout w:type="fixed"/>
         <w:tblLook w:firstColumn="1" w:firstRow="1" w:lastColumn="0" w:lastRow="0" w:noHBand="0" w:noVBand="1" w:val="04A0"/>
+        <w:tblBorders>
+          <w:top w:val="single" w:sz="4" w:color="D9D9D9"/>
+          <w:left w:val="single" w:sz="4" w:color="D9D9D9"/>
+          <w:bottom w:val="single" w:sz="4" w:color="D9D9D9"/>
+          <w:right w:val="single" w:sz="4" w:color="D9D9D9"/>
+          <w:insideH w:val="single" w:sz="4" w:color="D9D9D9"/>
+          <w:insideV w:val="single" w:sz="4" w:color="D9D9D9"/>
+        </w:tblBorders>
       </w:tblPr>
       <w:tblGrid>
         <w:gridCol w:w="2304"/>
@@ -403,13 +600,28 @@
         <w:tc>
           <w:tcPr>
             <w:tcW w:type="dxa" w:w="2304"/>
+            <w:vAlign w:val="center"/>
+            <w:shd w:fill="DDEBF7"/>
+            <w:tcMar>
+              <w:top w:w="70" w:type="dxa"/>
+              <w:bottom w:w="70" w:type="dxa"/>
+              <w:left w:w="70" w:type="dxa"/>
+              <w:right w:w="70" w:type="dxa"/>
+            </w:tcMar>
+            <w:tcBorders>
+              <w:top w:val="single" w:sz="4" w:color="D9D9D9"/>
+              <w:bottom w:val="single" w:sz="4" w:color="D9D9D9"/>
+              <w:left w:val="single" w:sz="4" w:color="D9D9D9"/>
+              <w:right w:val="single" w:sz="4" w:color="D9D9D9"/>
+            </w:tcBorders>
           </w:tcPr>
           <w:p>
             <w:pPr>
-              <w:spacing w:after="100"/>
+              <w:spacing w:after="40"/>
             </w:pPr>
             <w:r>
               <w:rPr>
+                <w:color w:val="000000"/>
                 <w:sz w:val="19"/>
               </w:rPr>
               <w:t>Service</w:t>
@@ -419,13 +631,28 @@
         <w:tc>
           <w:tcPr>
             <w:tcW w:type="dxa" w:w="7632"/>
+            <w:vAlign w:val="center"/>
+            <w:shd w:fill="DDEBF7"/>
+            <w:tcMar>
+              <w:top w:w="70" w:type="dxa"/>
+              <w:bottom w:w="70" w:type="dxa"/>
+              <w:left w:w="70" w:type="dxa"/>
+              <w:right w:w="70" w:type="dxa"/>
+            </w:tcMar>
+            <w:tcBorders>
+              <w:top w:val="single" w:sz="4" w:color="D9D9D9"/>
+              <w:bottom w:val="single" w:sz="4" w:color="D9D9D9"/>
+              <w:left w:val="single" w:sz="4" w:color="D9D9D9"/>
+              <w:right w:val="single" w:sz="4" w:color="D9D9D9"/>
+            </w:tcBorders>
           </w:tcPr>
           <w:p>
             <w:pPr>
-              <w:spacing w:after="100"/>
+              <w:spacing w:after="40"/>
             </w:pPr>
             <w:r>
               <w:rPr>
+                <w:color w:val="000000"/>
                 <w:sz w:val="19"/>
               </w:rPr>
               <w:t>Responsibility and boundary</w:t>
@@ -440,13 +667,28 @@
         <w:tc>
           <w:tcPr>
             <w:tcW w:type="dxa" w:w="2304"/>
+            <w:vAlign w:val="center"/>
+            <w:shd w:fill="FFFFFF"/>
+            <w:tcMar>
+              <w:top w:w="70" w:type="dxa"/>
+              <w:bottom w:w="70" w:type="dxa"/>
+              <w:left w:w="70" w:type="dxa"/>
+              <w:right w:w="70" w:type="dxa"/>
+            </w:tcMar>
+            <w:tcBorders>
+              <w:top w:val="single" w:sz="4" w:color="D9D9D9"/>
+              <w:bottom w:val="single" w:sz="4" w:color="D9D9D9"/>
+              <w:left w:val="single" w:sz="4" w:color="D9D9D9"/>
+              <w:right w:val="single" w:sz="4" w:color="D9D9D9"/>
+            </w:tcBorders>
           </w:tcPr>
           <w:p>
             <w:pPr>
-              <w:spacing w:after="100"/>
+              <w:spacing w:after="40"/>
             </w:pPr>
             <w:r>
               <w:rPr>
+                <w:color w:val="000000"/>
                 <w:sz w:val="19"/>
               </w:rPr>
               <w:t>tellumo-platform</w:t>
@@ -456,13 +698,28 @@
         <w:tc>
           <w:tcPr>
             <w:tcW w:type="dxa" w:w="7632"/>
+            <w:vAlign w:val="center"/>
+            <w:shd w:fill="FFFFFF"/>
+            <w:tcMar>
+              <w:top w:w="70" w:type="dxa"/>
+              <w:bottom w:w="70" w:type="dxa"/>
+              <w:left w:w="70" w:type="dxa"/>
+              <w:right w:w="70" w:type="dxa"/>
+            </w:tcMar>
+            <w:tcBorders>
+              <w:top w:val="single" w:sz="4" w:color="D9D9D9"/>
+              <w:bottom w:val="single" w:sz="4" w:color="D9D9D9"/>
+              <w:left w:val="single" w:sz="4" w:color="D9D9D9"/>
+              <w:right w:val="single" w:sz="4" w:color="D9D9D9"/>
+            </w:tcBorders>
           </w:tcPr>
           <w:p>
             <w:pPr>
-              <w:spacing w:after="100"/>
+              <w:spacing w:after="40"/>
             </w:pPr>
             <w:r>
               <w:rPr>
+                <w:color w:val="000000"/>
                 <w:sz w:val="19"/>
               </w:rPr>
               <w:t>Authenticated workspace, identity, conversation, model requests, policy checks, reviews and provider orchestration. Holds platform secrets.</w:t>
@@ -477,13 +734,28 @@
         <w:tc>
           <w:tcPr>
             <w:tcW w:type="dxa" w:w="2304"/>
+            <w:vAlign w:val="center"/>
+            <w:shd w:fill="FFFFFF"/>
+            <w:tcMar>
+              <w:top w:w="70" w:type="dxa"/>
+              <w:bottom w:w="70" w:type="dxa"/>
+              <w:left w:w="70" w:type="dxa"/>
+              <w:right w:w="70" w:type="dxa"/>
+            </w:tcMar>
+            <w:tcBorders>
+              <w:top w:val="single" w:sz="4" w:color="D9D9D9"/>
+              <w:bottom w:val="single" w:sz="4" w:color="D9D9D9"/>
+              <w:left w:val="single" w:sz="4" w:color="D9D9D9"/>
+              <w:right w:val="single" w:sz="4" w:color="D9D9D9"/>
+            </w:tcBorders>
           </w:tcPr>
           <w:p>
             <w:pPr>
-              <w:spacing w:after="100"/>
+              <w:spacing w:after="40"/>
             </w:pPr>
             <w:r>
               <w:rPr>
+                <w:color w:val="000000"/>
                 <w:sz w:val="19"/>
               </w:rPr>
               <w:t>tellumo-sites</w:t>
@@ -493,13 +765,28 @@
         <w:tc>
           <w:tcPr>
             <w:tcW w:type="dxa" w:w="7632"/>
+            <w:vAlign w:val="center"/>
+            <w:shd w:fill="FFFFFF"/>
+            <w:tcMar>
+              <w:top w:w="70" w:type="dxa"/>
+              <w:bottom w:w="70" w:type="dxa"/>
+              <w:left w:w="70" w:type="dxa"/>
+              <w:right w:w="70" w:type="dxa"/>
+            </w:tcMar>
+            <w:tcBorders>
+              <w:top w:val="single" w:sz="4" w:color="D9D9D9"/>
+              <w:bottom w:val="single" w:sz="4" w:color="D9D9D9"/>
+              <w:left w:val="single" w:sz="4" w:color="D9D9D9"/>
+              <w:right w:val="single" w:sz="4" w:color="D9D9D9"/>
+            </w:tcBorders>
           </w:tcPr>
           <w:p>
             <w:pPr>
-              <w:spacing w:after="100"/>
+              <w:spacing w:after="40"/>
             </w:pPr>
             <w:r>
               <w:rPr>
+                <w:color w:val="000000"/>
                 <w:sz w:val="19"/>
               </w:rPr>
               <w:t>Public website and approved CMS article delivery. Serves only approved current content and exact approved media. No control-plane authentication or AI secrets.</w:t>
@@ -514,13 +801,28 @@
         <w:tc>
           <w:tcPr>
             <w:tcW w:type="dxa" w:w="2304"/>
+            <w:vAlign w:val="center"/>
+            <w:shd w:fill="FFFFFF"/>
+            <w:tcMar>
+              <w:top w:w="70" w:type="dxa"/>
+              <w:bottom w:w="70" w:type="dxa"/>
+              <w:left w:w="70" w:type="dxa"/>
+              <w:right w:w="70" w:type="dxa"/>
+            </w:tcMar>
+            <w:tcBorders>
+              <w:top w:val="single" w:sz="4" w:color="D9D9D9"/>
+              <w:bottom w:val="single" w:sz="4" w:color="D9D9D9"/>
+              <w:left w:val="single" w:sz="4" w:color="D9D9D9"/>
+              <w:right w:val="single" w:sz="4" w:color="D9D9D9"/>
+            </w:tcBorders>
           </w:tcPr>
           <w:p>
             <w:pPr>
-              <w:spacing w:after="100"/>
+              <w:spacing w:after="40"/>
             </w:pPr>
             <w:r>
               <w:rPr>
+                <w:color w:val="000000"/>
                 <w:sz w:val="19"/>
               </w:rPr>
               <w:t>tellumo-apps</w:t>
@@ -530,13 +832,28 @@
         <w:tc>
           <w:tcPr>
             <w:tcW w:type="dxa" w:w="7632"/>
+            <w:vAlign w:val="center"/>
+            <w:shd w:fill="FFFFFF"/>
+            <w:tcMar>
+              <w:top w:w="70" w:type="dxa"/>
+              <w:bottom w:w="70" w:type="dxa"/>
+              <w:left w:w="70" w:type="dxa"/>
+              <w:right w:w="70" w:type="dxa"/>
+            </w:tcMar>
+            <w:tcBorders>
+              <w:top w:val="single" w:sz="4" w:color="D9D9D9"/>
+              <w:bottom w:val="single" w:sz="4" w:color="D9D9D9"/>
+              <w:left w:val="single" w:sz="4" w:color="D9D9D9"/>
+              <w:right w:val="single" w:sz="4" w:color="D9D9D9"/>
+            </w:tcBorders>
           </w:tcPr>
           <w:p>
             <w:pPr>
-              <w:spacing w:after="100"/>
+              <w:spacing w:after="40"/>
             </w:pPr>
             <w:r>
               <w:rPr>
+                <w:color w:val="000000"/>
                 <w:sz w:val="19"/>
               </w:rPr>
               <w:t>Controlled visitor application pages, visitor sessions and project-scoped application operations. Owner accounts and visitor accounts remain distinct.</w:t>
@@ -551,13 +868,28 @@
         <w:tc>
           <w:tcPr>
             <w:tcW w:type="dxa" w:w="2304"/>
+            <w:vAlign w:val="center"/>
+            <w:shd w:fill="FFFFFF"/>
+            <w:tcMar>
+              <w:top w:w="70" w:type="dxa"/>
+              <w:bottom w:w="70" w:type="dxa"/>
+              <w:left w:w="70" w:type="dxa"/>
+              <w:right w:w="70" w:type="dxa"/>
+            </w:tcMar>
+            <w:tcBorders>
+              <w:top w:val="single" w:sz="4" w:color="D9D9D9"/>
+              <w:bottom w:val="single" w:sz="4" w:color="D9D9D9"/>
+              <w:left w:val="single" w:sz="4" w:color="D9D9D9"/>
+              <w:right w:val="single" w:sz="4" w:color="D9D9D9"/>
+            </w:tcBorders>
           </w:tcPr>
           <w:p>
             <w:pPr>
-              <w:spacing w:after="100"/>
+              <w:spacing w:after="40"/>
             </w:pPr>
             <w:r>
               <w:rPr>
+                <w:color w:val="000000"/>
                 <w:sz w:val="19"/>
               </w:rPr>
               <w:t>tellumo-runtime</w:t>
@@ -567,13 +899,28 @@
         <w:tc>
           <w:tcPr>
             <w:tcW w:type="dxa" w:w="7632"/>
+            <w:vAlign w:val="center"/>
+            <w:shd w:fill="FFFFFF"/>
+            <w:tcMar>
+              <w:top w:w="70" w:type="dxa"/>
+              <w:bottom w:w="70" w:type="dxa"/>
+              <w:left w:w="70" w:type="dxa"/>
+              <w:right w:w="70" w:type="dxa"/>
+            </w:tcMar>
+            <w:tcBorders>
+              <w:top w:val="single" w:sz="4" w:color="D9D9D9"/>
+              <w:bottom w:val="single" w:sz="4" w:color="D9D9D9"/>
+              <w:left w:val="single" w:sz="4" w:color="D9D9D9"/>
+              <w:right w:val="single" w:sz="4" w:color="D9D9D9"/>
+            </w:tcBorders>
           </w:tcPr>
           <w:p>
             <w:pPr>
-              <w:spacing w:after="100"/>
+              <w:spacing w:after="40"/>
             </w:pPr>
             <w:r>
               <w:rPr>
+                <w:color w:val="000000"/>
                 <w:sz w:val="19"/>
               </w:rPr>
               <w:t>Bounded QuickJS execution for customer backend source. Customer code never runs directly in the control Worker.</w:t>
@@ -592,6 +939,9 @@
         <w:pStyle w:val="Heading2"/>
       </w:pPr>
       <w:r>
+        <w:rPr>
+          <w:color w:val="000000"/>
+        </w:rPr>
         <w:t>Data and resource ownership</w:t>
       </w:r>
     </w:p>
@@ -610,6 +960,9 @@
         <w:pStyle w:val="Heading2"/>
       </w:pPr>
       <w:r>
+        <w:rPr>
+          <w:color w:val="000000"/>
+        </w:rPr>
         <w:t>Action authority</w:t>
       </w:r>
     </w:p>
@@ -628,6 +981,9 @@
         <w:pStyle w:val="Heading2"/>
       </w:pPr>
       <w:r>
+        <w:rPr>
+          <w:color w:val="000000"/>
+        </w:rPr>
         <w:t>Future infrastructure</w:t>
       </w:r>
     </w:p>
@@ -644,9 +1000,14 @@
     <w:p>
       <w:pPr>
         <w:pStyle w:val="Heading1"/>
-        <w:pageBreakBefore/>
+        <w:keepNext/>
+        <w:pageBreakBefore w:val="0"/>
+        <w:spacing w:before="360"/>
       </w:pPr>
       <w:r>
+        <w:rPr>
+          <w:color w:val="000000"/>
+        </w:rPr>
         <w:t>Inference and model routing</w:t>
       </w:r>
     </w:p>
@@ -655,6 +1016,9 @@
         <w:pStyle w:val="Heading2"/>
       </w:pPr>
       <w:r>
+        <w:rPr>
+          <w:color w:val="000000"/>
+        </w:rPr>
         <w:t>Current test transport</w:t>
       </w:r>
     </w:p>
@@ -673,6 +1037,9 @@
         <w:pStyle w:val="Heading2"/>
       </w:pPr>
       <w:r>
+        <w:rPr>
+          <w:color w:val="000000"/>
+        </w:rPr>
         <w:t>Interaction timing and recovery</w:t>
       </w:r>
     </w:p>
@@ -691,6 +1058,9 @@
         <w:pStyle w:val="Heading2"/>
       </w:pPr>
       <w:r>
+        <w:rPr>
+          <w:color w:val="000000"/>
+        </w:rPr>
         <w:t>API funded beta routing</w:t>
       </w:r>
     </w:p>
@@ -701,7 +1071,7 @@
     </w:p>
     <w:p>
       <w:r>
-        <w:t>The route planner and durable operator/premium reservation foundation are implemented and locally tested, but are not live gateway dispatch. Platform, account and task budgets remain separate. Advanced roles need evaluator and runner gates. Opus, Sol, Astra and Fable are future candidate names, not verified API availability or configured model identifiers.</w:t>
+        <w:t>The route planner, durable spending reservations, OpenAI-compatible gateway transport and single-dispatch service are implemented and locally tested. Saved answers and bounded provider header identifiers support recovery. They are not wired into live Chat or a funded route. Header evidence is not a billable usage receipt. Migrations 0075 and 0076 remain unapplied remotely. Verified rates, funding, consent, invoice reconciliation and live gateway acceptance are still required. Opus, Sol, Astra and Fable remain future candidate names, not verified API identifiers.</w:t>
       </w:r>
     </w:p>
     <w:p>
@@ -709,6 +1079,9 @@
         <w:pStyle w:val="Heading2"/>
       </w:pPr>
       <w:r>
+        <w:rPr>
+          <w:color w:val="000000"/>
+        </w:rPr>
         <w:t>Premium consent</w:t>
       </w:r>
     </w:p>
@@ -725,9 +1098,14 @@
     <w:p>
       <w:pPr>
         <w:pStyle w:val="Heading1"/>
-        <w:pageBreakBefore/>
+        <w:keepNext/>
+        <w:pageBreakBefore w:val="0"/>
+        <w:spacing w:before="360"/>
       </w:pPr>
       <w:r>
+        <w:rPr>
+          <w:color w:val="000000"/>
+        </w:rPr>
         <w:t>Plans credits and fair use</w:t>
       </w:r>
     </w:p>
@@ -742,6 +1120,14 @@
         <w:tblW w:type="auto" w:w="0"/>
         <w:tblLayout w:type="fixed"/>
         <w:tblLook w:firstColumn="1" w:firstRow="1" w:lastColumn="0" w:lastRow="0" w:noHBand="0" w:noVBand="1" w:val="04A0"/>
+        <w:tblBorders>
+          <w:top w:val="single" w:sz="4" w:color="D9D9D9"/>
+          <w:left w:val="single" w:sz="4" w:color="D9D9D9"/>
+          <w:bottom w:val="single" w:sz="4" w:color="D9D9D9"/>
+          <w:right w:val="single" w:sz="4" w:color="D9D9D9"/>
+          <w:insideH w:val="single" w:sz="4" w:color="D9D9D9"/>
+          <w:insideV w:val="single" w:sz="4" w:color="D9D9D9"/>
+        </w:tblBorders>
       </w:tblPr>
       <w:tblGrid>
         <w:gridCol w:w="1800"/>
@@ -759,13 +1145,28 @@
         <w:tc>
           <w:tcPr>
             <w:tcW w:type="dxa" w:w="1800"/>
+            <w:vAlign w:val="center"/>
+            <w:shd w:fill="DDEBF7"/>
+            <w:tcMar>
+              <w:top w:w="70" w:type="dxa"/>
+              <w:bottom w:w="70" w:type="dxa"/>
+              <w:left w:w="70" w:type="dxa"/>
+              <w:right w:w="70" w:type="dxa"/>
+            </w:tcMar>
+            <w:tcBorders>
+              <w:top w:val="single" w:sz="4" w:color="D9D9D9"/>
+              <w:bottom w:val="single" w:sz="4" w:color="D9D9D9"/>
+              <w:left w:val="single" w:sz="4" w:color="D9D9D9"/>
+              <w:right w:val="single" w:sz="4" w:color="D9D9D9"/>
+            </w:tcBorders>
           </w:tcPr>
           <w:p>
             <w:pPr>
-              <w:spacing w:after="100"/>
+              <w:spacing w:after="40"/>
             </w:pPr>
             <w:r>
               <w:rPr>
+                <w:color w:val="000000"/>
                 <w:sz w:val="19"/>
               </w:rPr>
               <w:t>Plan</w:t>
@@ -775,13 +1176,28 @@
         <w:tc>
           <w:tcPr>
             <w:tcW w:type="dxa" w:w="1152"/>
+            <w:vAlign w:val="center"/>
+            <w:shd w:fill="DDEBF7"/>
+            <w:tcMar>
+              <w:top w:w="70" w:type="dxa"/>
+              <w:bottom w:w="70" w:type="dxa"/>
+              <w:left w:w="70" w:type="dxa"/>
+              <w:right w:w="70" w:type="dxa"/>
+            </w:tcMar>
+            <w:tcBorders>
+              <w:top w:val="single" w:sz="4" w:color="D9D9D9"/>
+              <w:bottom w:val="single" w:sz="4" w:color="D9D9D9"/>
+              <w:left w:val="single" w:sz="4" w:color="D9D9D9"/>
+              <w:right w:val="single" w:sz="4" w:color="D9D9D9"/>
+            </w:tcBorders>
           </w:tcPr>
           <w:p>
             <w:pPr>
-              <w:spacing w:after="100"/>
+              <w:spacing w:after="40"/>
             </w:pPr>
             <w:r>
               <w:rPr>
+                <w:color w:val="000000"/>
                 <w:sz w:val="19"/>
               </w:rPr>
               <w:t>Monthly</w:t>
@@ -791,13 +1207,28 @@
         <w:tc>
           <w:tcPr>
             <w:tcW w:type="dxa" w:w="1224"/>
+            <w:vAlign w:val="center"/>
+            <w:shd w:fill="DDEBF7"/>
+            <w:tcMar>
+              <w:top w:w="70" w:type="dxa"/>
+              <w:bottom w:w="70" w:type="dxa"/>
+              <w:left w:w="70" w:type="dxa"/>
+              <w:right w:w="70" w:type="dxa"/>
+            </w:tcMar>
+            <w:tcBorders>
+              <w:top w:val="single" w:sz="4" w:color="D9D9D9"/>
+              <w:bottom w:val="single" w:sz="4" w:color="D9D9D9"/>
+              <w:left w:val="single" w:sz="4" w:color="D9D9D9"/>
+              <w:right w:val="single" w:sz="4" w:color="D9D9D9"/>
+            </w:tcBorders>
           </w:tcPr>
           <w:p>
             <w:pPr>
-              <w:spacing w:after="100"/>
+              <w:spacing w:after="40"/>
             </w:pPr>
             <w:r>
               <w:rPr>
+                <w:color w:val="000000"/>
                 <w:sz w:val="19"/>
               </w:rPr>
               <w:t>Annual</w:t>
@@ -807,13 +1238,28 @@
         <w:tc>
           <w:tcPr>
             <w:tcW w:type="dxa" w:w="1728"/>
+            <w:vAlign w:val="center"/>
+            <w:shd w:fill="DDEBF7"/>
+            <w:tcMar>
+              <w:top w:w="70" w:type="dxa"/>
+              <w:bottom w:w="70" w:type="dxa"/>
+              <w:left w:w="70" w:type="dxa"/>
+              <w:right w:w="70" w:type="dxa"/>
+            </w:tcMar>
+            <w:tcBorders>
+              <w:top w:val="single" w:sz="4" w:color="D9D9D9"/>
+              <w:bottom w:val="single" w:sz="4" w:color="D9D9D9"/>
+              <w:left w:val="single" w:sz="4" w:color="D9D9D9"/>
+              <w:right w:val="single" w:sz="4" w:color="D9D9D9"/>
+            </w:tcBorders>
           </w:tcPr>
           <w:p>
             <w:pPr>
-              <w:spacing w:after="100"/>
+              <w:spacing w:after="40"/>
             </w:pPr>
             <w:r>
               <w:rPr>
+                <w:color w:val="000000"/>
                 <w:sz w:val="19"/>
               </w:rPr>
               <w:t>Annual domains</w:t>
@@ -823,13 +1269,28 @@
         <w:tc>
           <w:tcPr>
             <w:tcW w:type="dxa" w:w="1152"/>
+            <w:vAlign w:val="center"/>
+            <w:shd w:fill="DDEBF7"/>
+            <w:tcMar>
+              <w:top w:w="70" w:type="dxa"/>
+              <w:bottom w:w="70" w:type="dxa"/>
+              <w:left w:w="70" w:type="dxa"/>
+              <w:right w:w="70" w:type="dxa"/>
+            </w:tcMar>
+            <w:tcBorders>
+              <w:top w:val="single" w:sz="4" w:color="D9D9D9"/>
+              <w:bottom w:val="single" w:sz="4" w:color="D9D9D9"/>
+              <w:left w:val="single" w:sz="4" w:color="D9D9D9"/>
+              <w:right w:val="single" w:sz="4" w:color="D9D9D9"/>
+            </w:tcBorders>
           </w:tcPr>
           <w:p>
             <w:pPr>
-              <w:spacing w:after="100"/>
+              <w:spacing w:after="40"/>
             </w:pPr>
             <w:r>
               <w:rPr>
+                <w:color w:val="000000"/>
                 <w:sz w:val="19"/>
               </w:rPr>
               <w:t>Projects</w:t>
@@ -839,13 +1300,28 @@
         <w:tc>
           <w:tcPr>
             <w:tcW w:type="dxa" w:w="1440"/>
+            <w:vAlign w:val="center"/>
+            <w:shd w:fill="DDEBF7"/>
+            <w:tcMar>
+              <w:top w:w="70" w:type="dxa"/>
+              <w:bottom w:w="70" w:type="dxa"/>
+              <w:left w:w="70" w:type="dxa"/>
+              <w:right w:w="70" w:type="dxa"/>
+            </w:tcMar>
+            <w:tcBorders>
+              <w:top w:val="single" w:sz="4" w:color="D9D9D9"/>
+              <w:bottom w:val="single" w:sz="4" w:color="D9D9D9"/>
+              <w:left w:val="single" w:sz="4" w:color="D9D9D9"/>
+              <w:right w:val="single" w:sz="4" w:color="D9D9D9"/>
+            </w:tcBorders>
           </w:tcPr>
           <w:p>
             <w:pPr>
-              <w:spacing w:after="100"/>
+              <w:spacing w:after="40"/>
             </w:pPr>
             <w:r>
               <w:rPr>
+                <w:color w:val="000000"/>
                 <w:sz w:val="19"/>
               </w:rPr>
               <w:t>Files</w:t>
@@ -860,13 +1336,28 @@
         <w:tc>
           <w:tcPr>
             <w:tcW w:type="dxa" w:w="1800"/>
+            <w:vAlign w:val="center"/>
+            <w:shd w:fill="FFFFFF"/>
+            <w:tcMar>
+              <w:top w:w="70" w:type="dxa"/>
+              <w:bottom w:w="70" w:type="dxa"/>
+              <w:left w:w="70" w:type="dxa"/>
+              <w:right w:w="70" w:type="dxa"/>
+            </w:tcMar>
+            <w:tcBorders>
+              <w:top w:val="single" w:sz="4" w:color="D9D9D9"/>
+              <w:bottom w:val="single" w:sz="4" w:color="D9D9D9"/>
+              <w:left w:val="single" w:sz="4" w:color="D9D9D9"/>
+              <w:right w:val="single" w:sz="4" w:color="D9D9D9"/>
+            </w:tcBorders>
           </w:tcPr>
           <w:p>
             <w:pPr>
-              <w:spacing w:after="100"/>
+              <w:spacing w:after="40"/>
             </w:pPr>
             <w:r>
               <w:rPr>
+                <w:color w:val="000000"/>
                 <w:sz w:val="19"/>
               </w:rPr>
               <w:t>Starter</w:t>
@@ -876,13 +1367,28 @@
         <w:tc>
           <w:tcPr>
             <w:tcW w:type="dxa" w:w="1152"/>
+            <w:vAlign w:val="center"/>
+            <w:shd w:fill="FFFFFF"/>
+            <w:tcMar>
+              <w:top w:w="70" w:type="dxa"/>
+              <w:bottom w:w="70" w:type="dxa"/>
+              <w:left w:w="70" w:type="dxa"/>
+              <w:right w:w="70" w:type="dxa"/>
+            </w:tcMar>
+            <w:tcBorders>
+              <w:top w:val="single" w:sz="4" w:color="D9D9D9"/>
+              <w:bottom w:val="single" w:sz="4" w:color="D9D9D9"/>
+              <w:left w:val="single" w:sz="4" w:color="D9D9D9"/>
+              <w:right w:val="single" w:sz="4" w:color="D9D9D9"/>
+            </w:tcBorders>
           </w:tcPr>
           <w:p>
             <w:pPr>
-              <w:spacing w:after="100"/>
+              <w:spacing w:after="40"/>
             </w:pPr>
             <w:r>
               <w:rPr>
+                <w:color w:val="000000"/>
                 <w:sz w:val="19"/>
               </w:rPr>
               <w:t>$17</w:t>
@@ -892,13 +1398,28 @@
         <w:tc>
           <w:tcPr>
             <w:tcW w:type="dxa" w:w="1224"/>
+            <w:vAlign w:val="center"/>
+            <w:shd w:fill="FFFFFF"/>
+            <w:tcMar>
+              <w:top w:w="70" w:type="dxa"/>
+              <w:bottom w:w="70" w:type="dxa"/>
+              <w:left w:w="70" w:type="dxa"/>
+              <w:right w:w="70" w:type="dxa"/>
+            </w:tcMar>
+            <w:tcBorders>
+              <w:top w:val="single" w:sz="4" w:color="D9D9D9"/>
+              <w:bottom w:val="single" w:sz="4" w:color="D9D9D9"/>
+              <w:left w:val="single" w:sz="4" w:color="D9D9D9"/>
+              <w:right w:val="single" w:sz="4" w:color="D9D9D9"/>
+            </w:tcBorders>
           </w:tcPr>
           <w:p>
             <w:pPr>
-              <w:spacing w:after="100"/>
+              <w:spacing w:after="40"/>
             </w:pPr>
             <w:r>
               <w:rPr>
+                <w:color w:val="000000"/>
                 <w:sz w:val="19"/>
               </w:rPr>
               <w:t>$170</w:t>
@@ -908,13 +1429,28 @@
         <w:tc>
           <w:tcPr>
             <w:tcW w:type="dxa" w:w="1728"/>
+            <w:vAlign w:val="center"/>
+            <w:shd w:fill="FFFFFF"/>
+            <w:tcMar>
+              <w:top w:w="70" w:type="dxa"/>
+              <w:bottom w:w="70" w:type="dxa"/>
+              <w:left w:w="70" w:type="dxa"/>
+              <w:right w:w="70" w:type="dxa"/>
+            </w:tcMar>
+            <w:tcBorders>
+              <w:top w:val="single" w:sz="4" w:color="D9D9D9"/>
+              <w:bottom w:val="single" w:sz="4" w:color="D9D9D9"/>
+              <w:left w:val="single" w:sz="4" w:color="D9D9D9"/>
+              <w:right w:val="single" w:sz="4" w:color="D9D9D9"/>
+            </w:tcBorders>
           </w:tcPr>
           <w:p>
             <w:pPr>
-              <w:spacing w:after="100"/>
+              <w:spacing w:after="40"/>
             </w:pPr>
             <w:r>
               <w:rPr>
+                <w:color w:val="000000"/>
                 <w:sz w:val="19"/>
               </w:rPr>
               <w:t>1</w:t>
@@ -924,13 +1460,28 @@
         <w:tc>
           <w:tcPr>
             <w:tcW w:type="dxa" w:w="1152"/>
+            <w:vAlign w:val="center"/>
+            <w:shd w:fill="FFFFFF"/>
+            <w:tcMar>
+              <w:top w:w="70" w:type="dxa"/>
+              <w:bottom w:w="70" w:type="dxa"/>
+              <w:left w:w="70" w:type="dxa"/>
+              <w:right w:w="70" w:type="dxa"/>
+            </w:tcMar>
+            <w:tcBorders>
+              <w:top w:val="single" w:sz="4" w:color="D9D9D9"/>
+              <w:bottom w:val="single" w:sz="4" w:color="D9D9D9"/>
+              <w:left w:val="single" w:sz="4" w:color="D9D9D9"/>
+              <w:right w:val="single" w:sz="4" w:color="D9D9D9"/>
+            </w:tcBorders>
           </w:tcPr>
           <w:p>
             <w:pPr>
-              <w:spacing w:after="100"/>
+              <w:spacing w:after="40"/>
             </w:pPr>
             <w:r>
               <w:rPr>
+                <w:color w:val="000000"/>
                 <w:sz w:val="19"/>
               </w:rPr>
               <w:t>1</w:t>
@@ -940,13 +1491,28 @@
         <w:tc>
           <w:tcPr>
             <w:tcW w:type="dxa" w:w="1440"/>
+            <w:vAlign w:val="center"/>
+            <w:shd w:fill="FFFFFF"/>
+            <w:tcMar>
+              <w:top w:w="70" w:type="dxa"/>
+              <w:bottom w:w="70" w:type="dxa"/>
+              <w:left w:w="70" w:type="dxa"/>
+              <w:right w:w="70" w:type="dxa"/>
+            </w:tcMar>
+            <w:tcBorders>
+              <w:top w:val="single" w:sz="4" w:color="D9D9D9"/>
+              <w:bottom w:val="single" w:sz="4" w:color="D9D9D9"/>
+              <w:left w:val="single" w:sz="4" w:color="D9D9D9"/>
+              <w:right w:val="single" w:sz="4" w:color="D9D9D9"/>
+            </w:tcBorders>
           </w:tcPr>
           <w:p>
             <w:pPr>
-              <w:spacing w:after="100"/>
+              <w:spacing w:after="40"/>
             </w:pPr>
             <w:r>
               <w:rPr>
+                <w:color w:val="000000"/>
                 <w:sz w:val="19"/>
               </w:rPr>
               <w:t>10 GB</w:t>
@@ -961,13 +1527,28 @@
         <w:tc>
           <w:tcPr>
             <w:tcW w:type="dxa" w:w="1800"/>
+            <w:vAlign w:val="center"/>
+            <w:shd w:fill="FFFFFF"/>
+            <w:tcMar>
+              <w:top w:w="70" w:type="dxa"/>
+              <w:bottom w:w="70" w:type="dxa"/>
+              <w:left w:w="70" w:type="dxa"/>
+              <w:right w:w="70" w:type="dxa"/>
+            </w:tcMar>
+            <w:tcBorders>
+              <w:top w:val="single" w:sz="4" w:color="D9D9D9"/>
+              <w:bottom w:val="single" w:sz="4" w:color="D9D9D9"/>
+              <w:left w:val="single" w:sz="4" w:color="D9D9D9"/>
+              <w:right w:val="single" w:sz="4" w:color="D9D9D9"/>
+            </w:tcBorders>
           </w:tcPr>
           <w:p>
             <w:pPr>
-              <w:spacing w:after="100"/>
+              <w:spacing w:after="40"/>
             </w:pPr>
             <w:r>
               <w:rPr>
+                <w:color w:val="000000"/>
                 <w:sz w:val="19"/>
               </w:rPr>
               <w:t>Personal</w:t>
@@ -977,13 +1558,28 @@
         <w:tc>
           <w:tcPr>
             <w:tcW w:type="dxa" w:w="1152"/>
+            <w:vAlign w:val="center"/>
+            <w:shd w:fill="FFFFFF"/>
+            <w:tcMar>
+              <w:top w:w="70" w:type="dxa"/>
+              <w:bottom w:w="70" w:type="dxa"/>
+              <w:left w:w="70" w:type="dxa"/>
+              <w:right w:w="70" w:type="dxa"/>
+            </w:tcMar>
+            <w:tcBorders>
+              <w:top w:val="single" w:sz="4" w:color="D9D9D9"/>
+              <w:bottom w:val="single" w:sz="4" w:color="D9D9D9"/>
+              <w:left w:val="single" w:sz="4" w:color="D9D9D9"/>
+              <w:right w:val="single" w:sz="4" w:color="D9D9D9"/>
+            </w:tcBorders>
           </w:tcPr>
           <w:p>
             <w:pPr>
-              <w:spacing w:after="100"/>
+              <w:spacing w:after="40"/>
             </w:pPr>
             <w:r>
               <w:rPr>
+                <w:color w:val="000000"/>
                 <w:sz w:val="19"/>
               </w:rPr>
               <w:t>$30</w:t>
@@ -993,13 +1589,28 @@
         <w:tc>
           <w:tcPr>
             <w:tcW w:type="dxa" w:w="1224"/>
+            <w:vAlign w:val="center"/>
+            <w:shd w:fill="FFFFFF"/>
+            <w:tcMar>
+              <w:top w:w="70" w:type="dxa"/>
+              <w:bottom w:w="70" w:type="dxa"/>
+              <w:left w:w="70" w:type="dxa"/>
+              <w:right w:w="70" w:type="dxa"/>
+            </w:tcMar>
+            <w:tcBorders>
+              <w:top w:val="single" w:sz="4" w:color="D9D9D9"/>
+              <w:bottom w:val="single" w:sz="4" w:color="D9D9D9"/>
+              <w:left w:val="single" w:sz="4" w:color="D9D9D9"/>
+              <w:right w:val="single" w:sz="4" w:color="D9D9D9"/>
+            </w:tcBorders>
           </w:tcPr>
           <w:p>
             <w:pPr>
-              <w:spacing w:after="100"/>
+              <w:spacing w:after="40"/>
             </w:pPr>
             <w:r>
               <w:rPr>
+                <w:color w:val="000000"/>
                 <w:sz w:val="19"/>
               </w:rPr>
               <w:t>$300</w:t>
@@ -1009,13 +1620,28 @@
         <w:tc>
           <w:tcPr>
             <w:tcW w:type="dxa" w:w="1728"/>
+            <w:vAlign w:val="center"/>
+            <w:shd w:fill="FFFFFF"/>
+            <w:tcMar>
+              <w:top w:w="70" w:type="dxa"/>
+              <w:bottom w:w="70" w:type="dxa"/>
+              <w:left w:w="70" w:type="dxa"/>
+              <w:right w:w="70" w:type="dxa"/>
+            </w:tcMar>
+            <w:tcBorders>
+              <w:top w:val="single" w:sz="4" w:color="D9D9D9"/>
+              <w:bottom w:val="single" w:sz="4" w:color="D9D9D9"/>
+              <w:left w:val="single" w:sz="4" w:color="D9D9D9"/>
+              <w:right w:val="single" w:sz="4" w:color="D9D9D9"/>
+            </w:tcBorders>
           </w:tcPr>
           <w:p>
             <w:pPr>
-              <w:spacing w:after="100"/>
+              <w:spacing w:after="40"/>
             </w:pPr>
             <w:r>
               <w:rPr>
+                <w:color w:val="000000"/>
                 <w:sz w:val="19"/>
               </w:rPr>
               <w:t>1</w:t>
@@ -1025,13 +1651,28 @@
         <w:tc>
           <w:tcPr>
             <w:tcW w:type="dxa" w:w="1152"/>
+            <w:vAlign w:val="center"/>
+            <w:shd w:fill="FFFFFF"/>
+            <w:tcMar>
+              <w:top w:w="70" w:type="dxa"/>
+              <w:bottom w:w="70" w:type="dxa"/>
+              <w:left w:w="70" w:type="dxa"/>
+              <w:right w:w="70" w:type="dxa"/>
+            </w:tcMar>
+            <w:tcBorders>
+              <w:top w:val="single" w:sz="4" w:color="D9D9D9"/>
+              <w:bottom w:val="single" w:sz="4" w:color="D9D9D9"/>
+              <w:left w:val="single" w:sz="4" w:color="D9D9D9"/>
+              <w:right w:val="single" w:sz="4" w:color="D9D9D9"/>
+            </w:tcBorders>
           </w:tcPr>
           <w:p>
             <w:pPr>
-              <w:spacing w:after="100"/>
+              <w:spacing w:after="40"/>
             </w:pPr>
             <w:r>
               <w:rPr>
+                <w:color w:val="000000"/>
                 <w:sz w:val="19"/>
               </w:rPr>
               <w:t>5</w:t>
@@ -1041,13 +1682,28 @@
         <w:tc>
           <w:tcPr>
             <w:tcW w:type="dxa" w:w="1440"/>
+            <w:vAlign w:val="center"/>
+            <w:shd w:fill="FFFFFF"/>
+            <w:tcMar>
+              <w:top w:w="70" w:type="dxa"/>
+              <w:bottom w:w="70" w:type="dxa"/>
+              <w:left w:w="70" w:type="dxa"/>
+              <w:right w:w="70" w:type="dxa"/>
+            </w:tcMar>
+            <w:tcBorders>
+              <w:top w:val="single" w:sz="4" w:color="D9D9D9"/>
+              <w:bottom w:val="single" w:sz="4" w:color="D9D9D9"/>
+              <w:left w:val="single" w:sz="4" w:color="D9D9D9"/>
+              <w:right w:val="single" w:sz="4" w:color="D9D9D9"/>
+            </w:tcBorders>
           </w:tcPr>
           <w:p>
             <w:pPr>
-              <w:spacing w:after="100"/>
+              <w:spacing w:after="40"/>
             </w:pPr>
             <w:r>
               <w:rPr>
+                <w:color w:val="000000"/>
                 <w:sz w:val="19"/>
               </w:rPr>
               <w:t>50 GB</w:t>
@@ -1062,13 +1718,28 @@
         <w:tc>
           <w:tcPr>
             <w:tcW w:type="dxa" w:w="1800"/>
+            <w:vAlign w:val="center"/>
+            <w:shd w:fill="FFFFFF"/>
+            <w:tcMar>
+              <w:top w:w="70" w:type="dxa"/>
+              <w:bottom w:w="70" w:type="dxa"/>
+              <w:left w:w="70" w:type="dxa"/>
+              <w:right w:w="70" w:type="dxa"/>
+            </w:tcMar>
+            <w:tcBorders>
+              <w:top w:val="single" w:sz="4" w:color="D9D9D9"/>
+              <w:bottom w:val="single" w:sz="4" w:color="D9D9D9"/>
+              <w:left w:val="single" w:sz="4" w:color="D9D9D9"/>
+              <w:right w:val="single" w:sz="4" w:color="D9D9D9"/>
+            </w:tcBorders>
           </w:tcPr>
           <w:p>
             <w:pPr>
-              <w:spacing w:after="100"/>
+              <w:spacing w:after="40"/>
             </w:pPr>
             <w:r>
               <w:rPr>
+                <w:color w:val="000000"/>
                 <w:sz w:val="19"/>
               </w:rPr>
               <w:t>Business</w:t>
@@ -1078,13 +1749,28 @@
         <w:tc>
           <w:tcPr>
             <w:tcW w:type="dxa" w:w="1152"/>
+            <w:vAlign w:val="center"/>
+            <w:shd w:fill="FFFFFF"/>
+            <w:tcMar>
+              <w:top w:w="70" w:type="dxa"/>
+              <w:bottom w:w="70" w:type="dxa"/>
+              <w:left w:w="70" w:type="dxa"/>
+              <w:right w:w="70" w:type="dxa"/>
+            </w:tcMar>
+            <w:tcBorders>
+              <w:top w:val="single" w:sz="4" w:color="D9D9D9"/>
+              <w:bottom w:val="single" w:sz="4" w:color="D9D9D9"/>
+              <w:left w:val="single" w:sz="4" w:color="D9D9D9"/>
+              <w:right w:val="single" w:sz="4" w:color="D9D9D9"/>
+            </w:tcBorders>
           </w:tcPr>
           <w:p>
             <w:pPr>
-              <w:spacing w:after="100"/>
+              <w:spacing w:after="40"/>
             </w:pPr>
             <w:r>
               <w:rPr>
+                <w:color w:val="000000"/>
                 <w:sz w:val="19"/>
               </w:rPr>
               <w:t>$79</w:t>
@@ -1094,13 +1780,28 @@
         <w:tc>
           <w:tcPr>
             <w:tcW w:type="dxa" w:w="1224"/>
+            <w:vAlign w:val="center"/>
+            <w:shd w:fill="FFFFFF"/>
+            <w:tcMar>
+              <w:top w:w="70" w:type="dxa"/>
+              <w:bottom w:w="70" w:type="dxa"/>
+              <w:left w:w="70" w:type="dxa"/>
+              <w:right w:w="70" w:type="dxa"/>
+            </w:tcMar>
+            <w:tcBorders>
+              <w:top w:val="single" w:sz="4" w:color="D9D9D9"/>
+              <w:bottom w:val="single" w:sz="4" w:color="D9D9D9"/>
+              <w:left w:val="single" w:sz="4" w:color="D9D9D9"/>
+              <w:right w:val="single" w:sz="4" w:color="D9D9D9"/>
+            </w:tcBorders>
           </w:tcPr>
           <w:p>
             <w:pPr>
-              <w:spacing w:after="100"/>
+              <w:spacing w:after="40"/>
             </w:pPr>
             <w:r>
               <w:rPr>
+                <w:color w:val="000000"/>
                 <w:sz w:val="19"/>
               </w:rPr>
               <w:t>$790</w:t>
@@ -1110,13 +1811,28 @@
         <w:tc>
           <w:tcPr>
             <w:tcW w:type="dxa" w:w="1728"/>
+            <w:vAlign w:val="center"/>
+            <w:shd w:fill="FFFFFF"/>
+            <w:tcMar>
+              <w:top w:w="70" w:type="dxa"/>
+              <w:bottom w:w="70" w:type="dxa"/>
+              <w:left w:w="70" w:type="dxa"/>
+              <w:right w:w="70" w:type="dxa"/>
+            </w:tcMar>
+            <w:tcBorders>
+              <w:top w:val="single" w:sz="4" w:color="D9D9D9"/>
+              <w:bottom w:val="single" w:sz="4" w:color="D9D9D9"/>
+              <w:left w:val="single" w:sz="4" w:color="D9D9D9"/>
+              <w:right w:val="single" w:sz="4" w:color="D9D9D9"/>
+            </w:tcBorders>
           </w:tcPr>
           <w:p>
             <w:pPr>
-              <w:spacing w:after="100"/>
+              <w:spacing w:after="40"/>
             </w:pPr>
             <w:r>
               <w:rPr>
+                <w:color w:val="000000"/>
                 <w:sz w:val="19"/>
               </w:rPr>
               <w:t>1</w:t>
@@ -1126,13 +1842,28 @@
         <w:tc>
           <w:tcPr>
             <w:tcW w:type="dxa" w:w="1152"/>
+            <w:vAlign w:val="center"/>
+            <w:shd w:fill="FFFFFF"/>
+            <w:tcMar>
+              <w:top w:w="70" w:type="dxa"/>
+              <w:bottom w:w="70" w:type="dxa"/>
+              <w:left w:w="70" w:type="dxa"/>
+              <w:right w:w="70" w:type="dxa"/>
+            </w:tcMar>
+            <w:tcBorders>
+              <w:top w:val="single" w:sz="4" w:color="D9D9D9"/>
+              <w:bottom w:val="single" w:sz="4" w:color="D9D9D9"/>
+              <w:left w:val="single" w:sz="4" w:color="D9D9D9"/>
+              <w:right w:val="single" w:sz="4" w:color="D9D9D9"/>
+            </w:tcBorders>
           </w:tcPr>
           <w:p>
             <w:pPr>
-              <w:spacing w:after="100"/>
+              <w:spacing w:after="40"/>
             </w:pPr>
             <w:r>
               <w:rPr>
+                <w:color w:val="000000"/>
                 <w:sz w:val="19"/>
               </w:rPr>
               <w:t>10</w:t>
@@ -1142,13 +1873,28 @@
         <w:tc>
           <w:tcPr>
             <w:tcW w:type="dxa" w:w="1440"/>
+            <w:vAlign w:val="center"/>
+            <w:shd w:fill="FFFFFF"/>
+            <w:tcMar>
+              <w:top w:w="70" w:type="dxa"/>
+              <w:bottom w:w="70" w:type="dxa"/>
+              <w:left w:w="70" w:type="dxa"/>
+              <w:right w:w="70" w:type="dxa"/>
+            </w:tcMar>
+            <w:tcBorders>
+              <w:top w:val="single" w:sz="4" w:color="D9D9D9"/>
+              <w:bottom w:val="single" w:sz="4" w:color="D9D9D9"/>
+              <w:left w:val="single" w:sz="4" w:color="D9D9D9"/>
+              <w:right w:val="single" w:sz="4" w:color="D9D9D9"/>
+            </w:tcBorders>
           </w:tcPr>
           <w:p>
             <w:pPr>
-              <w:spacing w:after="100"/>
+              <w:spacing w:after="40"/>
             </w:pPr>
             <w:r>
               <w:rPr>
+                <w:color w:val="000000"/>
                 <w:sz w:val="19"/>
               </w:rPr>
               <w:t>200 GB</w:t>
@@ -1163,13 +1909,28 @@
         <w:tc>
           <w:tcPr>
             <w:tcW w:type="dxa" w:w="1800"/>
+            <w:vAlign w:val="center"/>
+            <w:shd w:fill="FFFFFF"/>
+            <w:tcMar>
+              <w:top w:w="70" w:type="dxa"/>
+              <w:bottom w:w="70" w:type="dxa"/>
+              <w:left w:w="70" w:type="dxa"/>
+              <w:right w:w="70" w:type="dxa"/>
+            </w:tcMar>
+            <w:tcBorders>
+              <w:top w:val="single" w:sz="4" w:color="D9D9D9"/>
+              <w:bottom w:val="single" w:sz="4" w:color="D9D9D9"/>
+              <w:left w:val="single" w:sz="4" w:color="D9D9D9"/>
+              <w:right w:val="single" w:sz="4" w:color="D9D9D9"/>
+            </w:tcBorders>
           </w:tcPr>
           <w:p>
             <w:pPr>
-              <w:spacing w:after="100"/>
+              <w:spacing w:after="40"/>
             </w:pPr>
             <w:r>
               <w:rPr>
+                <w:color w:val="000000"/>
                 <w:sz w:val="19"/>
               </w:rPr>
               <w:t>Business Pro</w:t>
@@ -1179,13 +1940,28 @@
         <w:tc>
           <w:tcPr>
             <w:tcW w:type="dxa" w:w="1152"/>
+            <w:vAlign w:val="center"/>
+            <w:shd w:fill="FFFFFF"/>
+            <w:tcMar>
+              <w:top w:w="70" w:type="dxa"/>
+              <w:bottom w:w="70" w:type="dxa"/>
+              <w:left w:w="70" w:type="dxa"/>
+              <w:right w:w="70" w:type="dxa"/>
+            </w:tcMar>
+            <w:tcBorders>
+              <w:top w:val="single" w:sz="4" w:color="D9D9D9"/>
+              <w:bottom w:val="single" w:sz="4" w:color="D9D9D9"/>
+              <w:left w:val="single" w:sz="4" w:color="D9D9D9"/>
+              <w:right w:val="single" w:sz="4" w:color="D9D9D9"/>
+            </w:tcBorders>
           </w:tcPr>
           <w:p>
             <w:pPr>
-              <w:spacing w:after="100"/>
+              <w:spacing w:after="40"/>
             </w:pPr>
             <w:r>
               <w:rPr>
+                <w:color w:val="000000"/>
                 <w:sz w:val="19"/>
               </w:rPr>
               <w:t>$139</w:t>
@@ -1195,13 +1971,28 @@
         <w:tc>
           <w:tcPr>
             <w:tcW w:type="dxa" w:w="1224"/>
+            <w:vAlign w:val="center"/>
+            <w:shd w:fill="FFFFFF"/>
+            <w:tcMar>
+              <w:top w:w="70" w:type="dxa"/>
+              <w:bottom w:w="70" w:type="dxa"/>
+              <w:left w:w="70" w:type="dxa"/>
+              <w:right w:w="70" w:type="dxa"/>
+            </w:tcMar>
+            <w:tcBorders>
+              <w:top w:val="single" w:sz="4" w:color="D9D9D9"/>
+              <w:bottom w:val="single" w:sz="4" w:color="D9D9D9"/>
+              <w:left w:val="single" w:sz="4" w:color="D9D9D9"/>
+              <w:right w:val="single" w:sz="4" w:color="D9D9D9"/>
+            </w:tcBorders>
           </w:tcPr>
           <w:p>
             <w:pPr>
-              <w:spacing w:after="100"/>
+              <w:spacing w:after="40"/>
             </w:pPr>
             <w:r>
               <w:rPr>
+                <w:color w:val="000000"/>
                 <w:sz w:val="19"/>
               </w:rPr>
               <w:t>$1,390</w:t>
@@ -1211,13 +2002,28 @@
         <w:tc>
           <w:tcPr>
             <w:tcW w:type="dxa" w:w="1728"/>
+            <w:vAlign w:val="center"/>
+            <w:shd w:fill="FFFFFF"/>
+            <w:tcMar>
+              <w:top w:w="70" w:type="dxa"/>
+              <w:bottom w:w="70" w:type="dxa"/>
+              <w:left w:w="70" w:type="dxa"/>
+              <w:right w:w="70" w:type="dxa"/>
+            </w:tcMar>
+            <w:tcBorders>
+              <w:top w:val="single" w:sz="4" w:color="D9D9D9"/>
+              <w:bottom w:val="single" w:sz="4" w:color="D9D9D9"/>
+              <w:left w:val="single" w:sz="4" w:color="D9D9D9"/>
+              <w:right w:val="single" w:sz="4" w:color="D9D9D9"/>
+            </w:tcBorders>
           </w:tcPr>
           <w:p>
             <w:pPr>
-              <w:spacing w:after="100"/>
+              <w:spacing w:after="40"/>
             </w:pPr>
             <w:r>
               <w:rPr>
+                <w:color w:val="000000"/>
                 <w:sz w:val="19"/>
               </w:rPr>
               <w:t>2</w:t>
@@ -1227,13 +2033,28 @@
         <w:tc>
           <w:tcPr>
             <w:tcW w:type="dxa" w:w="1152"/>
+            <w:vAlign w:val="center"/>
+            <w:shd w:fill="FFFFFF"/>
+            <w:tcMar>
+              <w:top w:w="70" w:type="dxa"/>
+              <w:bottom w:w="70" w:type="dxa"/>
+              <w:left w:w="70" w:type="dxa"/>
+              <w:right w:w="70" w:type="dxa"/>
+            </w:tcMar>
+            <w:tcBorders>
+              <w:top w:val="single" w:sz="4" w:color="D9D9D9"/>
+              <w:bottom w:val="single" w:sz="4" w:color="D9D9D9"/>
+              <w:left w:val="single" w:sz="4" w:color="D9D9D9"/>
+              <w:right w:val="single" w:sz="4" w:color="D9D9D9"/>
+            </w:tcBorders>
           </w:tcPr>
           <w:p>
             <w:pPr>
-              <w:spacing w:after="100"/>
+              <w:spacing w:after="40"/>
             </w:pPr>
             <w:r>
               <w:rPr>
+                <w:color w:val="000000"/>
                 <w:sz w:val="19"/>
               </w:rPr>
               <w:t>25</w:t>
@@ -1243,13 +2064,28 @@
         <w:tc>
           <w:tcPr>
             <w:tcW w:type="dxa" w:w="1440"/>
+            <w:vAlign w:val="center"/>
+            <w:shd w:fill="FFFFFF"/>
+            <w:tcMar>
+              <w:top w:w="70" w:type="dxa"/>
+              <w:bottom w:w="70" w:type="dxa"/>
+              <w:left w:w="70" w:type="dxa"/>
+              <w:right w:w="70" w:type="dxa"/>
+            </w:tcMar>
+            <w:tcBorders>
+              <w:top w:val="single" w:sz="4" w:color="D9D9D9"/>
+              <w:bottom w:val="single" w:sz="4" w:color="D9D9D9"/>
+              <w:left w:val="single" w:sz="4" w:color="D9D9D9"/>
+              <w:right w:val="single" w:sz="4" w:color="D9D9D9"/>
+            </w:tcBorders>
           </w:tcPr>
           <w:p>
             <w:pPr>
-              <w:spacing w:after="100"/>
+              <w:spacing w:after="40"/>
             </w:pPr>
             <w:r>
               <w:rPr>
+                <w:color w:val="000000"/>
                 <w:sz w:val="19"/>
               </w:rPr>
               <w:t>500 GB</w:t>
@@ -1273,6 +2109,9 @@
         <w:pStyle w:val="Heading2"/>
       </w:pPr>
       <w:r>
+        <w:rPr>
+          <w:color w:val="000000"/>
+        </w:rPr>
         <w:t>Test credits are a separate system</w:t>
       </w:r>
     </w:p>
@@ -1286,6 +2125,9 @@
         <w:pStyle w:val="Heading2"/>
       </w:pPr>
       <w:r>
+        <w:rPr>
+          <w:color w:val="000000"/>
+        </w:rPr>
         <w:t>Monitor is the default</w:t>
       </w:r>
     </w:p>
@@ -1300,6 +2142,14 @@
         <w:tblW w:type="auto" w:w="0"/>
         <w:tblLayout w:type="fixed"/>
         <w:tblLook w:firstColumn="1" w:firstRow="1" w:lastColumn="0" w:lastRow="0" w:noHBand="0" w:noVBand="1" w:val="04A0"/>
+        <w:tblBorders>
+          <w:top w:val="single" w:sz="4" w:color="D9D9D9"/>
+          <w:left w:val="single" w:sz="4" w:color="D9D9D9"/>
+          <w:bottom w:val="single" w:sz="4" w:color="D9D9D9"/>
+          <w:right w:val="single" w:sz="4" w:color="D9D9D9"/>
+          <w:insideH w:val="single" w:sz="4" w:color="D9D9D9"/>
+          <w:insideV w:val="single" w:sz="4" w:color="D9D9D9"/>
+        </w:tblBorders>
       </w:tblPr>
       <w:tblGrid>
         <w:gridCol w:w="1728"/>
@@ -1315,13 +2165,28 @@
         <w:tc>
           <w:tcPr>
             <w:tcW w:type="dxa" w:w="1728"/>
+            <w:vAlign w:val="center"/>
+            <w:shd w:fill="DDEBF7"/>
+            <w:tcMar>
+              <w:top w:w="70" w:type="dxa"/>
+              <w:bottom w:w="70" w:type="dxa"/>
+              <w:left w:w="70" w:type="dxa"/>
+              <w:right w:w="70" w:type="dxa"/>
+            </w:tcMar>
+            <w:tcBorders>
+              <w:top w:val="single" w:sz="4" w:color="D9D9D9"/>
+              <w:bottom w:val="single" w:sz="4" w:color="D9D9D9"/>
+              <w:left w:val="single" w:sz="4" w:color="D9D9D9"/>
+              <w:right w:val="single" w:sz="4" w:color="D9D9D9"/>
+            </w:tcBorders>
           </w:tcPr>
           <w:p>
             <w:pPr>
-              <w:spacing w:after="100"/>
+              <w:spacing w:after="40"/>
             </w:pPr>
             <w:r>
               <w:rPr>
+                <w:color w:val="000000"/>
                 <w:sz w:val="19"/>
               </w:rPr>
               <w:t>Tier</w:t>
@@ -1331,13 +2196,28 @@
         <w:tc>
           <w:tcPr>
             <w:tcW w:type="dxa" w:w="2304"/>
+            <w:vAlign w:val="center"/>
+            <w:shd w:fill="DDEBF7"/>
+            <w:tcMar>
+              <w:top w:w="70" w:type="dxa"/>
+              <w:bottom w:w="70" w:type="dxa"/>
+              <w:left w:w="70" w:type="dxa"/>
+              <w:right w:w="70" w:type="dxa"/>
+            </w:tcMar>
+            <w:tcBorders>
+              <w:top w:val="single" w:sz="4" w:color="D9D9D9"/>
+              <w:bottom w:val="single" w:sz="4" w:color="D9D9D9"/>
+              <w:left w:val="single" w:sz="4" w:color="D9D9D9"/>
+              <w:right w:val="single" w:sz="4" w:color="D9D9D9"/>
+            </w:tcBorders>
           </w:tcPr>
           <w:p>
             <w:pPr>
-              <w:spacing w:after="100"/>
+              <w:spacing w:after="40"/>
             </w:pPr>
             <w:r>
               <w:rPr>
+                <w:color w:val="000000"/>
                 <w:sz w:val="19"/>
               </w:rPr>
               <w:t>30 day cost bands</w:t>
@@ -1347,13 +2227,28 @@
         <w:tc>
           <w:tcPr>
             <w:tcW w:type="dxa" w:w="3600"/>
+            <w:vAlign w:val="center"/>
+            <w:shd w:fill="DDEBF7"/>
+            <w:tcMar>
+              <w:top w:w="70" w:type="dxa"/>
+              <w:bottom w:w="70" w:type="dxa"/>
+              <w:left w:w="70" w:type="dxa"/>
+              <w:right w:w="70" w:type="dxa"/>
+            </w:tcMar>
+            <w:tcBorders>
+              <w:top w:val="single" w:sz="4" w:color="D9D9D9"/>
+              <w:bottom w:val="single" w:sz="4" w:color="D9D9D9"/>
+              <w:left w:val="single" w:sz="4" w:color="D9D9D9"/>
+              <w:right w:val="single" w:sz="4" w:color="D9D9D9"/>
+            </w:tcBorders>
           </w:tcPr>
           <w:p>
             <w:pPr>
-              <w:spacing w:after="100"/>
+              <w:spacing w:after="40"/>
             </w:pPr>
             <w:r>
               <w:rPr>
+                <w:color w:val="000000"/>
                 <w:sz w:val="19"/>
               </w:rPr>
               <w:t>7 day turns observe or review</w:t>
@@ -1363,13 +2258,28 @@
         <w:tc>
           <w:tcPr>
             <w:tcW w:type="dxa" w:w="2160"/>
+            <w:vAlign w:val="center"/>
+            <w:shd w:fill="DDEBF7"/>
+            <w:tcMar>
+              <w:top w:w="70" w:type="dxa"/>
+              <w:bottom w:w="70" w:type="dxa"/>
+              <w:left w:w="70" w:type="dxa"/>
+              <w:right w:w="70" w:type="dxa"/>
+            </w:tcMar>
+            <w:tcBorders>
+              <w:top w:val="single" w:sz="4" w:color="D9D9D9"/>
+              <w:bottom w:val="single" w:sz="4" w:color="D9D9D9"/>
+              <w:left w:val="single" w:sz="4" w:color="D9D9D9"/>
+              <w:right w:val="single" w:sz="4" w:color="D9D9D9"/>
+            </w:tcBorders>
           </w:tcPr>
           <w:p>
             <w:pPr>
-              <w:spacing w:after="100"/>
+              <w:spacing w:after="40"/>
             </w:pPr>
             <w:r>
               <w:rPr>
+                <w:color w:val="000000"/>
                 <w:sz w:val="19"/>
               </w:rPr>
               <w:t>Export delete cycles</w:t>
@@ -1384,13 +2294,28 @@
         <w:tc>
           <w:tcPr>
             <w:tcW w:type="dxa" w:w="1728"/>
+            <w:vAlign w:val="center"/>
+            <w:shd w:fill="FFFFFF"/>
+            <w:tcMar>
+              <w:top w:w="70" w:type="dxa"/>
+              <w:bottom w:w="70" w:type="dxa"/>
+              <w:left w:w="70" w:type="dxa"/>
+              <w:right w:w="70" w:type="dxa"/>
+            </w:tcMar>
+            <w:tcBorders>
+              <w:top w:val="single" w:sz="4" w:color="D9D9D9"/>
+              <w:bottom w:val="single" w:sz="4" w:color="D9D9D9"/>
+              <w:left w:val="single" w:sz="4" w:color="D9D9D9"/>
+              <w:right w:val="single" w:sz="4" w:color="D9D9D9"/>
+            </w:tcBorders>
           </w:tcPr>
           <w:p>
             <w:pPr>
-              <w:spacing w:after="100"/>
+              <w:spacing w:after="40"/>
             </w:pPr>
             <w:r>
               <w:rPr>
+                <w:color w:val="000000"/>
                 <w:sz w:val="19"/>
               </w:rPr>
               <w:t>Starter</w:t>
@@ -1400,13 +2325,28 @@
         <w:tc>
           <w:tcPr>
             <w:tcW w:type="dxa" w:w="2304"/>
+            <w:vAlign w:val="center"/>
+            <w:shd w:fill="FFFFFF"/>
+            <w:tcMar>
+              <w:top w:w="70" w:type="dxa"/>
+              <w:bottom w:w="70" w:type="dxa"/>
+              <w:left w:w="70" w:type="dxa"/>
+              <w:right w:w="70" w:type="dxa"/>
+            </w:tcMar>
+            <w:tcBorders>
+              <w:top w:val="single" w:sz="4" w:color="D9D9D9"/>
+              <w:bottom w:val="single" w:sz="4" w:color="D9D9D9"/>
+              <w:left w:val="single" w:sz="4" w:color="D9D9D9"/>
+              <w:right w:val="single" w:sz="4" w:color="D9D9D9"/>
+            </w:tcBorders>
           </w:tcPr>
           <w:p>
             <w:pPr>
-              <w:spacing w:after="100"/>
+              <w:spacing w:after="40"/>
             </w:pPr>
             <w:r>
               <w:rPr>
+                <w:color w:val="000000"/>
                 <w:sz w:val="19"/>
               </w:rPr>
               <w:t>$3 / $6 / $10</w:t>
@@ -1416,13 +2356,28 @@
         <w:tc>
           <w:tcPr>
             <w:tcW w:type="dxa" w:w="3600"/>
+            <w:vAlign w:val="center"/>
+            <w:shd w:fill="FFFFFF"/>
+            <w:tcMar>
+              <w:top w:w="70" w:type="dxa"/>
+              <w:bottom w:w="70" w:type="dxa"/>
+              <w:left w:w="70" w:type="dxa"/>
+              <w:right w:w="70" w:type="dxa"/>
+            </w:tcMar>
+            <w:tcBorders>
+              <w:top w:val="single" w:sz="4" w:color="D9D9D9"/>
+              <w:bottom w:val="single" w:sz="4" w:color="D9D9D9"/>
+              <w:left w:val="single" w:sz="4" w:color="D9D9D9"/>
+              <w:right w:val="single" w:sz="4" w:color="D9D9D9"/>
+            </w:tcBorders>
           </w:tcPr>
           <w:p>
             <w:pPr>
-              <w:spacing w:after="100"/>
+              <w:spacing w:after="40"/>
             </w:pPr>
             <w:r>
               <w:rPr>
+                <w:color w:val="000000"/>
                 <w:sz w:val="19"/>
               </w:rPr>
               <w:t>100 / 250</w:t>
@@ -1432,13 +2387,28 @@
         <w:tc>
           <w:tcPr>
             <w:tcW w:type="dxa" w:w="2160"/>
+            <w:vAlign w:val="center"/>
+            <w:shd w:fill="FFFFFF"/>
+            <w:tcMar>
+              <w:top w:w="70" w:type="dxa"/>
+              <w:bottom w:w="70" w:type="dxa"/>
+              <w:left w:w="70" w:type="dxa"/>
+              <w:right w:w="70" w:type="dxa"/>
+            </w:tcMar>
+            <w:tcBorders>
+              <w:top w:val="single" w:sz="4" w:color="D9D9D9"/>
+              <w:bottom w:val="single" w:sz="4" w:color="D9D9D9"/>
+              <w:left w:val="single" w:sz="4" w:color="D9D9D9"/>
+              <w:right w:val="single" w:sz="4" w:color="D9D9D9"/>
+            </w:tcBorders>
           </w:tcPr>
           <w:p>
             <w:pPr>
-              <w:spacing w:after="100"/>
+              <w:spacing w:after="40"/>
             </w:pPr>
             <w:r>
               <w:rPr>
+                <w:color w:val="000000"/>
                 <w:sz w:val="19"/>
               </w:rPr>
               <w:t>3</w:t>
@@ -1453,13 +2423,28 @@
         <w:tc>
           <w:tcPr>
             <w:tcW w:type="dxa" w:w="1728"/>
+            <w:vAlign w:val="center"/>
+            <w:shd w:fill="FFFFFF"/>
+            <w:tcMar>
+              <w:top w:w="70" w:type="dxa"/>
+              <w:bottom w:w="70" w:type="dxa"/>
+              <w:left w:w="70" w:type="dxa"/>
+              <w:right w:w="70" w:type="dxa"/>
+            </w:tcMar>
+            <w:tcBorders>
+              <w:top w:val="single" w:sz="4" w:color="D9D9D9"/>
+              <w:bottom w:val="single" w:sz="4" w:color="D9D9D9"/>
+              <w:left w:val="single" w:sz="4" w:color="D9D9D9"/>
+              <w:right w:val="single" w:sz="4" w:color="D9D9D9"/>
+            </w:tcBorders>
           </w:tcPr>
           <w:p>
             <w:pPr>
-              <w:spacing w:after="100"/>
+              <w:spacing w:after="40"/>
             </w:pPr>
             <w:r>
               <w:rPr>
+                <w:color w:val="000000"/>
                 <w:sz w:val="19"/>
               </w:rPr>
               <w:t>Personal</w:t>
@@ -1469,13 +2454,28 @@
         <w:tc>
           <w:tcPr>
             <w:tcW w:type="dxa" w:w="2304"/>
+            <w:vAlign w:val="center"/>
+            <w:shd w:fill="FFFFFF"/>
+            <w:tcMar>
+              <w:top w:w="70" w:type="dxa"/>
+              <w:bottom w:w="70" w:type="dxa"/>
+              <w:left w:w="70" w:type="dxa"/>
+              <w:right w:w="70" w:type="dxa"/>
+            </w:tcMar>
+            <w:tcBorders>
+              <w:top w:val="single" w:sz="4" w:color="D9D9D9"/>
+              <w:bottom w:val="single" w:sz="4" w:color="D9D9D9"/>
+              <w:left w:val="single" w:sz="4" w:color="D9D9D9"/>
+              <w:right w:val="single" w:sz="4" w:color="D9D9D9"/>
+            </w:tcBorders>
           </w:tcPr>
           <w:p>
             <w:pPr>
-              <w:spacing w:after="100"/>
+              <w:spacing w:after="40"/>
             </w:pPr>
             <w:r>
               <w:rPr>
+                <w:color w:val="000000"/>
                 <w:sz w:val="19"/>
               </w:rPr>
               <w:t>$6 / $12 / $20</w:t>
@@ -1485,13 +2485,28 @@
         <w:tc>
           <w:tcPr>
             <w:tcW w:type="dxa" w:w="3600"/>
+            <w:vAlign w:val="center"/>
+            <w:shd w:fill="FFFFFF"/>
+            <w:tcMar>
+              <w:top w:w="70" w:type="dxa"/>
+              <w:bottom w:w="70" w:type="dxa"/>
+              <w:left w:w="70" w:type="dxa"/>
+              <w:right w:w="70" w:type="dxa"/>
+            </w:tcMar>
+            <w:tcBorders>
+              <w:top w:val="single" w:sz="4" w:color="D9D9D9"/>
+              <w:bottom w:val="single" w:sz="4" w:color="D9D9D9"/>
+              <w:left w:val="single" w:sz="4" w:color="D9D9D9"/>
+              <w:right w:val="single" w:sz="4" w:color="D9D9D9"/>
+            </w:tcBorders>
           </w:tcPr>
           <w:p>
             <w:pPr>
-              <w:spacing w:after="100"/>
+              <w:spacing w:after="40"/>
             </w:pPr>
             <w:r>
               <w:rPr>
+                <w:color w:val="000000"/>
                 <w:sz w:val="19"/>
               </w:rPr>
               <w:t>250 / 600</w:t>
@@ -1501,13 +2516,28 @@
         <w:tc>
           <w:tcPr>
             <w:tcW w:type="dxa" w:w="2160"/>
+            <w:vAlign w:val="center"/>
+            <w:shd w:fill="FFFFFF"/>
+            <w:tcMar>
+              <w:top w:w="70" w:type="dxa"/>
+              <w:bottom w:w="70" w:type="dxa"/>
+              <w:left w:w="70" w:type="dxa"/>
+              <w:right w:w="70" w:type="dxa"/>
+            </w:tcMar>
+            <w:tcBorders>
+              <w:top w:val="single" w:sz="4" w:color="D9D9D9"/>
+              <w:bottom w:val="single" w:sz="4" w:color="D9D9D9"/>
+              <w:left w:val="single" w:sz="4" w:color="D9D9D9"/>
+              <w:right w:val="single" w:sz="4" w:color="D9D9D9"/>
+            </w:tcBorders>
           </w:tcPr>
           <w:p>
             <w:pPr>
-              <w:spacing w:after="100"/>
+              <w:spacing w:after="40"/>
             </w:pPr>
             <w:r>
               <w:rPr>
+                <w:color w:val="000000"/>
                 <w:sz w:val="19"/>
               </w:rPr>
               <w:t>6</w:t>
@@ -1522,13 +2552,28 @@
         <w:tc>
           <w:tcPr>
             <w:tcW w:type="dxa" w:w="1728"/>
+            <w:vAlign w:val="center"/>
+            <w:shd w:fill="FFFFFF"/>
+            <w:tcMar>
+              <w:top w:w="70" w:type="dxa"/>
+              <w:bottom w:w="70" w:type="dxa"/>
+              <w:left w:w="70" w:type="dxa"/>
+              <w:right w:w="70" w:type="dxa"/>
+            </w:tcMar>
+            <w:tcBorders>
+              <w:top w:val="single" w:sz="4" w:color="D9D9D9"/>
+              <w:bottom w:val="single" w:sz="4" w:color="D9D9D9"/>
+              <w:left w:val="single" w:sz="4" w:color="D9D9D9"/>
+              <w:right w:val="single" w:sz="4" w:color="D9D9D9"/>
+            </w:tcBorders>
           </w:tcPr>
           <w:p>
             <w:pPr>
-              <w:spacing w:after="100"/>
+              <w:spacing w:after="40"/>
             </w:pPr>
             <w:r>
               <w:rPr>
+                <w:color w:val="000000"/>
                 <w:sz w:val="19"/>
               </w:rPr>
               <w:t>Business</w:t>
@@ -1538,13 +2583,28 @@
         <w:tc>
           <w:tcPr>
             <w:tcW w:type="dxa" w:w="2304"/>
+            <w:vAlign w:val="center"/>
+            <w:shd w:fill="FFFFFF"/>
+            <w:tcMar>
+              <w:top w:w="70" w:type="dxa"/>
+              <w:bottom w:w="70" w:type="dxa"/>
+              <w:left w:w="70" w:type="dxa"/>
+              <w:right w:w="70" w:type="dxa"/>
+            </w:tcMar>
+            <w:tcBorders>
+              <w:top w:val="single" w:sz="4" w:color="D9D9D9"/>
+              <w:bottom w:val="single" w:sz="4" w:color="D9D9D9"/>
+              <w:left w:val="single" w:sz="4" w:color="D9D9D9"/>
+              <w:right w:val="single" w:sz="4" w:color="D9D9D9"/>
+            </w:tcBorders>
           </w:tcPr>
           <w:p>
             <w:pPr>
-              <w:spacing w:after="100"/>
+              <w:spacing w:after="40"/>
             </w:pPr>
             <w:r>
               <w:rPr>
+                <w:color w:val="000000"/>
                 <w:sz w:val="19"/>
               </w:rPr>
               <w:t>$16 / $32 / $50</w:t>
@@ -1554,13 +2614,28 @@
         <w:tc>
           <w:tcPr>
             <w:tcW w:type="dxa" w:w="3600"/>
+            <w:vAlign w:val="center"/>
+            <w:shd w:fill="FFFFFF"/>
+            <w:tcMar>
+              <w:top w:w="70" w:type="dxa"/>
+              <w:bottom w:w="70" w:type="dxa"/>
+              <w:left w:w="70" w:type="dxa"/>
+              <w:right w:w="70" w:type="dxa"/>
+            </w:tcMar>
+            <w:tcBorders>
+              <w:top w:val="single" w:sz="4" w:color="D9D9D9"/>
+              <w:bottom w:val="single" w:sz="4" w:color="D9D9D9"/>
+              <w:left w:val="single" w:sz="4" w:color="D9D9D9"/>
+              <w:right w:val="single" w:sz="4" w:color="D9D9D9"/>
+            </w:tcBorders>
           </w:tcPr>
           <w:p>
             <w:pPr>
-              <w:spacing w:after="100"/>
+              <w:spacing w:after="40"/>
             </w:pPr>
             <w:r>
               <w:rPr>
+                <w:color w:val="000000"/>
                 <w:sz w:val="19"/>
               </w:rPr>
               <w:t>750 / 1,800</w:t>
@@ -1570,13 +2645,28 @@
         <w:tc>
           <w:tcPr>
             <w:tcW w:type="dxa" w:w="2160"/>
+            <w:vAlign w:val="center"/>
+            <w:shd w:fill="FFFFFF"/>
+            <w:tcMar>
+              <w:top w:w="70" w:type="dxa"/>
+              <w:bottom w:w="70" w:type="dxa"/>
+              <w:left w:w="70" w:type="dxa"/>
+              <w:right w:w="70" w:type="dxa"/>
+            </w:tcMar>
+            <w:tcBorders>
+              <w:top w:val="single" w:sz="4" w:color="D9D9D9"/>
+              <w:bottom w:val="single" w:sz="4" w:color="D9D9D9"/>
+              <w:left w:val="single" w:sz="4" w:color="D9D9D9"/>
+              <w:right w:val="single" w:sz="4" w:color="D9D9D9"/>
+            </w:tcBorders>
           </w:tcPr>
           <w:p>
             <w:pPr>
-              <w:spacing w:after="100"/>
+              <w:spacing w:after="40"/>
             </w:pPr>
             <w:r>
               <w:rPr>
+                <w:color w:val="000000"/>
                 <w:sz w:val="19"/>
               </w:rPr>
               <w:t>12</w:t>
@@ -1591,13 +2681,28 @@
         <w:tc>
           <w:tcPr>
             <w:tcW w:type="dxa" w:w="1728"/>
+            <w:vAlign w:val="center"/>
+            <w:shd w:fill="FFFFFF"/>
+            <w:tcMar>
+              <w:top w:w="70" w:type="dxa"/>
+              <w:bottom w:w="70" w:type="dxa"/>
+              <w:left w:w="70" w:type="dxa"/>
+              <w:right w:w="70" w:type="dxa"/>
+            </w:tcMar>
+            <w:tcBorders>
+              <w:top w:val="single" w:sz="4" w:color="D9D9D9"/>
+              <w:bottom w:val="single" w:sz="4" w:color="D9D9D9"/>
+              <w:left w:val="single" w:sz="4" w:color="D9D9D9"/>
+              <w:right w:val="single" w:sz="4" w:color="D9D9D9"/>
+            </w:tcBorders>
           </w:tcPr>
           <w:p>
             <w:pPr>
-              <w:spacing w:after="100"/>
+              <w:spacing w:after="40"/>
             </w:pPr>
             <w:r>
               <w:rPr>
+                <w:color w:val="000000"/>
                 <w:sz w:val="19"/>
               </w:rPr>
               <w:t>Business Pro</w:t>
@@ -1607,13 +2712,28 @@
         <w:tc>
           <w:tcPr>
             <w:tcW w:type="dxa" w:w="2304"/>
+            <w:vAlign w:val="center"/>
+            <w:shd w:fill="FFFFFF"/>
+            <w:tcMar>
+              <w:top w:w="70" w:type="dxa"/>
+              <w:bottom w:w="70" w:type="dxa"/>
+              <w:left w:w="70" w:type="dxa"/>
+              <w:right w:w="70" w:type="dxa"/>
+            </w:tcMar>
+            <w:tcBorders>
+              <w:top w:val="single" w:sz="4" w:color="D9D9D9"/>
+              <w:bottom w:val="single" w:sz="4" w:color="D9D9D9"/>
+              <w:left w:val="single" w:sz="4" w:color="D9D9D9"/>
+              <w:right w:val="single" w:sz="4" w:color="D9D9D9"/>
+            </w:tcBorders>
           </w:tcPr>
           <w:p>
             <w:pPr>
-              <w:spacing w:after="100"/>
+              <w:spacing w:after="40"/>
             </w:pPr>
             <w:r>
               <w:rPr>
+                <w:color w:val="000000"/>
                 <w:sz w:val="19"/>
               </w:rPr>
               <w:t>$28 / $56 / $90</w:t>
@@ -1623,13 +2743,28 @@
         <w:tc>
           <w:tcPr>
             <w:tcW w:type="dxa" w:w="3600"/>
+            <w:vAlign w:val="center"/>
+            <w:shd w:fill="FFFFFF"/>
+            <w:tcMar>
+              <w:top w:w="70" w:type="dxa"/>
+              <w:bottom w:w="70" w:type="dxa"/>
+              <w:left w:w="70" w:type="dxa"/>
+              <w:right w:w="70" w:type="dxa"/>
+            </w:tcMar>
+            <w:tcBorders>
+              <w:top w:val="single" w:sz="4" w:color="D9D9D9"/>
+              <w:bottom w:val="single" w:sz="4" w:color="D9D9D9"/>
+              <w:left w:val="single" w:sz="4" w:color="D9D9D9"/>
+              <w:right w:val="single" w:sz="4" w:color="D9D9D9"/>
+            </w:tcBorders>
           </w:tcPr>
           <w:p>
             <w:pPr>
-              <w:spacing w:after="100"/>
+              <w:spacing w:after="40"/>
             </w:pPr>
             <w:r>
               <w:rPr>
+                <w:color w:val="000000"/>
                 <w:sz w:val="19"/>
               </w:rPr>
               <w:t>1,500 / 3,500</w:t>
@@ -1639,13 +2774,28 @@
         <w:tc>
           <w:tcPr>
             <w:tcW w:type="dxa" w:w="2160"/>
+            <w:vAlign w:val="center"/>
+            <w:shd w:fill="FFFFFF"/>
+            <w:tcMar>
+              <w:top w:w="70" w:type="dxa"/>
+              <w:bottom w:w="70" w:type="dxa"/>
+              <w:left w:w="70" w:type="dxa"/>
+              <w:right w:w="70" w:type="dxa"/>
+            </w:tcMar>
+            <w:tcBorders>
+              <w:top w:val="single" w:sz="4" w:color="D9D9D9"/>
+              <w:bottom w:val="single" w:sz="4" w:color="D9D9D9"/>
+              <w:left w:val="single" w:sz="4" w:color="D9D9D9"/>
+              <w:right w:val="single" w:sz="4" w:color="D9D9D9"/>
+            </w:tcBorders>
           </w:tcPr>
           <w:p>
             <w:pPr>
-              <w:spacing w:after="100"/>
+              <w:spacing w:after="40"/>
             </w:pPr>
             <w:r>
               <w:rPr>
+                <w:color w:val="000000"/>
                 <w:sz w:val="19"/>
               </w:rPr>
               <w:t>20</w:t>
@@ -1661,15 +2811,20 @@
     </w:p>
     <w:p>
       <w:r>
-        <w:t>These are initial observation/review hypotheses, not enforced caps or validated economics. Active enforcement remains unimplemented. The proposed eligibility check requires an operator choice plus fresh comparable company periods showing lower profit and margin with substantially stable revenue. Missing or stale finance evidence cannot activate it. Individual review, notice, continuation evidence and an appeal/expiry process are also required. The operator may keep Monitor despite outliers.</w:t>
+        <w:t>These thresholds are initial observation hypotheses, not enforced caps or validated economics. Active enforcement remains unimplemented. A private operator report now compares adjacent closed periods of earned revenue and seven expense categories; absent values remain unknown. Revenue within 5 percent, falling profit and a margin decline of at least 5 percentage points can suggest review. Inputs are operator-attested, never independently verified. The report cannot change Monitor mode or restrict a customer. Actual financial ingestion, reconciliation, individual review, notice, continued-misuse evidence and appeals remain open. The operator may retain Monitor despite outliers.</w:t>
       </w:r>
     </w:p>
     <w:p>
       <w:pPr>
         <w:pStyle w:val="Heading1"/>
-        <w:pageBreakBefore/>
+        <w:keepNext/>
+        <w:pageBreakBefore w:val="0"/>
+        <w:spacing w:before="360"/>
       </w:pPr>
       <w:r>
+        <w:rPr>
+          <w:color w:val="000000"/>
+        </w:rPr>
         <w:t>Website and application delivery</w:t>
       </w:r>
     </w:p>
@@ -1678,6 +2833,9 @@
         <w:pStyle w:val="Heading2"/>
       </w:pPr>
       <w:r>
+        <w:rPr>
+          <w:color w:val="000000"/>
+        </w:rPr>
         <w:t>Build preview publish and restore</w:t>
       </w:r>
     </w:p>
@@ -1701,6 +2859,9 @@
         <w:pStyle w:val="Heading2"/>
       </w:pPr>
       <w:r>
+        <w:rPr>
+          <w:color w:val="000000"/>
+        </w:rPr>
         <w:t>Controlled dynamic services</w:t>
       </w:r>
     </w:p>
@@ -1719,6 +2880,9 @@
         <w:pStyle w:val="Heading2"/>
       </w:pPr>
       <w:r>
+        <w:rPr>
+          <w:color w:val="000000"/>
+        </w:rPr>
         <w:t>Safe reusable code</w:t>
       </w:r>
     </w:p>
@@ -1737,6 +2901,9 @@
         <w:pStyle w:val="Heading2"/>
       </w:pPr>
       <w:r>
+        <w:rPr>
+          <w:color w:val="000000"/>
+        </w:rPr>
         <w:t>Acceptance scope</w:t>
       </w:r>
     </w:p>
@@ -1748,9 +2915,14 @@
     <w:p>
       <w:pPr>
         <w:pStyle w:val="Heading1"/>
-        <w:pageBreakBefore/>
+        <w:keepNext/>
+        <w:pageBreakBefore w:val="0"/>
+        <w:spacing w:before="360"/>
       </w:pPr>
       <w:r>
+        <w:rPr>
+          <w:color w:val="000000"/>
+        </w:rPr>
         <w:t>CMS domains and optional accounts</w:t>
       </w:r>
     </w:p>
@@ -1759,17 +2931,32 @@
         <w:pStyle w:val="Heading2"/>
       </w:pPr>
       <w:r>
+        <w:rPr>
+          <w:color w:val="000000"/>
+        </w:rPr>
         <w:t>EmDash and WordPress</w:t>
       </w:r>
     </w:p>
     <w:p>
       <w:r>
-        <w:t>EmDash support includes native workload preparation, project registration, private content editing, rich text, image-aware edits, preview, publication/withdrawal reviews and recovery tooling. WordPress export upload retains private source bytes, performs bounded analysis and prepares explicit imports into private drafts. Connected local owner-to-native tests verify exact content and lost-response recovery.</w:t>
+        <w:t>EmDash 1.0.1 support includes isolated workload preparation, private post/page editing, excerpts, media, exact preview and publication reviews. WordPress exports retain private source bytes and produce explicit article imports. New reviews can include supported root categories and tags, with exact labels and slugs and a maximum of 20 terms. Unsupported hierarchy, translations, custom taxonomy or ambiguous assignments stop the mapping review. Media, themes, plugins and accounts are not imported.</w:t>
       </w:r>
     </w:p>
     <w:p>
       <w:r>
-        <w:t>No native customer CMS instance is registered in the inspected test environment. First live provisioning requires a concrete resource/cost and customer review. Complete WordPress migration still needs broader metadata mapping, reviewed media acquisition and acceptance. Database snapshots and media snapshots have separate contracts; successful database restoration alone is not a complete CMS backup.</w:t>
+        <w:t>Approved imports reserve one native draft identity, reconcile exact matching definitions and terms, and apply initial taxonomy assignments before the control database exposes the draft. Lost responses reuse the original review and native receipts. This is not a transaction across the control and native databases: unfinished private native objects may remain for recovery. Actual built EmDash tests recovered four imports as exactly four articles. No customer CMS instance is currently registered. First live provisioning and customer acceptance still require the concrete resource and customer review.</w:t>
+      </w:r>
+    </w:p>
+    <w:p>
+      <w:pPr/>
+      <w:r>
+        <w:t>Customers can use /cms-pending to find saved setup, import, draft, edit, publish, unpublish and discard work, with exact review or recovery commands. The owner-scoped inventory is paginated and omits completed or expired unapproved work. Opening it makes no provider calls and confirms nothing. Import-backed drafts appear under their original import review; uploads remain in the publishing desk.</w:t>
+      </w:r>
+    </w:p>
+    <w:p>
+      <w:pPr/>
+      <w:r>
+        <w:t>Operator recovery tooling pairs logical database captures with private media manifests, verifies digests and restores into disposable local stores. Actual EmDash boots and edits successfully after the local restore. Full production recovery still requires coordinated write quiescence, keys and artifacts, control/publication state, isolated provider restoration and reviewed traffic switching.</w:t>
       </w:r>
     </w:p>
     <w:p>
@@ -1777,6 +2964,9 @@
         <w:pStyle w:val="Heading2"/>
       </w:pPr>
       <w:r>
+        <w:rPr>
+          <w:color w:val="000000"/>
+        </w:rPr>
         <w:t>Existing domains</w:t>
       </w:r>
     </w:p>
@@ -1795,6 +2985,9 @@
         <w:pStyle w:val="Heading2"/>
       </w:pPr>
       <w:r>
+        <w:rPr>
+          <w:color w:val="000000"/>
+        </w:rPr>
         <w:t>Optional customer authorization</w:t>
       </w:r>
     </w:p>
@@ -1813,6 +3006,9 @@
         <w:pStyle w:val="Heading2"/>
       </w:pPr>
       <w:r>
+        <w:rPr>
+          <w:color w:val="000000"/>
+        </w:rPr>
         <w:t>Purchases and larger deployments</w:t>
       </w:r>
     </w:p>
@@ -1829,9 +3025,14 @@
     <w:p>
       <w:pPr>
         <w:pStyle w:val="Heading1"/>
-        <w:pageBreakBefore/>
+        <w:keepNext/>
+        <w:pageBreakBefore w:val="0"/>
+        <w:spacing w:before="360"/>
       </w:pPr>
       <w:r>
+        <w:rPr>
+          <w:color w:val="000000"/>
+        </w:rPr>
         <w:t>Operations and release discipline</w:t>
       </w:r>
     </w:p>
@@ -1840,12 +3041,15 @@
         <w:pStyle w:val="Heading2"/>
       </w:pPr>
       <w:r>
+        <w:rPr>
+          <w:color w:val="000000"/>
+        </w:rPr>
         <w:t>Source and configuration</w:t>
       </w:r>
     </w:p>
     <w:p>
       <w:r>
-        <w:t>Source resides in the private zemdregon/whumpo repository. TypeScript Workers are in src; the React UI is in frontend; controlled visitor source is in web/visitor.js. Root wrangler configurations define the four services. Numbered migrations under migrations are authoritative for D1 changes. Use Node.js 24 and pnpm 11.</w:t>
+        <w:t>Source resides in the private zemdregon/whumpo repository. TypeScript Workers are in src; the React UI is in frontend; controlled visitor assets are in public-app, with visitor build source in web/visitor.js. Root wrangler configurations define the four services. Numbered migrations under migrations govern platform D1 changes. Native EmDash migrations live separately under integrations/emdash/migrations and must never be applied to the control database. Code tooling uses Node.js 24 and pnpm 11.</w:t>
       </w:r>
     </w:p>
     <w:p>
@@ -1858,6 +3062,9 @@
         <w:pStyle w:val="Heading2"/>
       </w:pPr>
       <w:r>
+        <w:rPr>
+          <w:color w:val="000000"/>
+        </w:rPr>
         <w:t>Release procedure</w:t>
       </w:r>
     </w:p>
@@ -1898,6 +3105,9 @@
         <w:pStyle w:val="Heading2"/>
       </w:pPr>
       <w:r>
+        <w:rPr>
+          <w:color w:val="000000"/>
+        </w:rPr>
         <w:t>Recovery procedure</w:t>
       </w:r>
     </w:p>
@@ -1916,20 +3126,28 @@
         <w:pStyle w:val="Heading2"/>
       </w:pPr>
       <w:r>
+        <w:rPr>
+          <w:color w:val="000000"/>
+        </w:rPr>
         <w:t>Verified live snapshot</w:t>
       </w:r>
     </w:p>
     <w:p>
       <w:r>
-        <w:t>Read-only inspection on September 29, 2026 confirmed platform version 6bc298a1-18ab-46d8-89e8-5d899db1b87e, migration 0074_domain_proof_removals.sql, Monitor mode and zero registered CMS instances. Secret-name inspection found AI_API_KEY, PASSWORD_PEPPER and TURNSTILE_SECRET only. Customer authorization, custom-domain and Stripe secret sets were absent. No credential values or customer content were collected for this document.</w:t>
+        <w:t>Read-only inspection on September 30, 2026 confirmed platform version 2304496a-7c65-429c-a201-72254448b33e at 100 percent, Monitor mode and zero registered CMS instances. Recent applied migrations are 0074, 0077, 0078 and 0079; gateway migrations 0075 and 0076 remain inactive. Secret-name inspection confirms AI, Turnstile, password and Cloudflare OAuth/encryption configuration. GitHub and Stripe secret sets are absent. Configured OAuth does not prove customer consent or DNS acceptance. No credential values or customer content were printed or collected for this document.</w:t>
       </w:r>
     </w:p>
     <w:p>
       <w:pPr>
         <w:pStyle w:val="Heading1"/>
-        <w:pageBreakBefore/>
+        <w:keepNext/>
+        <w:pageBreakBefore w:val="0"/>
+        <w:spacing w:before="360"/>
       </w:pPr>
       <w:r>
+        <w:rPr>
+          <w:color w:val="000000"/>
+        </w:rPr>
         <w:t>MVP exit gates and evidence</w:t>
       </w:r>
     </w:p>
@@ -1944,6 +3162,14 @@
         <w:tblW w:type="auto" w:w="0"/>
         <w:tblLayout w:type="fixed"/>
         <w:tblLook w:firstColumn="1" w:firstRow="1" w:lastColumn="0" w:lastRow="0" w:noHBand="0" w:noVBand="1" w:val="04A0"/>
+        <w:tblBorders>
+          <w:top w:val="single" w:sz="4" w:color="D9D9D9"/>
+          <w:left w:val="single" w:sz="4" w:color="D9D9D9"/>
+          <w:bottom w:val="single" w:sz="4" w:color="D9D9D9"/>
+          <w:right w:val="single" w:sz="4" w:color="D9D9D9"/>
+          <w:insideH w:val="single" w:sz="4" w:color="D9D9D9"/>
+          <w:insideV w:val="single" w:sz="4" w:color="D9D9D9"/>
+        </w:tblBorders>
       </w:tblPr>
       <w:tblGrid>
         <w:gridCol w:w="2304"/>
@@ -1957,13 +3183,28 @@
         <w:tc>
           <w:tcPr>
             <w:tcW w:type="dxa" w:w="2304"/>
+            <w:vAlign w:val="center"/>
+            <w:shd w:fill="DDEBF7"/>
+            <w:tcMar>
+              <w:top w:w="70" w:type="dxa"/>
+              <w:bottom w:w="70" w:type="dxa"/>
+              <w:left w:w="70" w:type="dxa"/>
+              <w:right w:w="70" w:type="dxa"/>
+            </w:tcMar>
+            <w:tcBorders>
+              <w:top w:val="single" w:sz="4" w:color="D9D9D9"/>
+              <w:bottom w:val="single" w:sz="4" w:color="D9D9D9"/>
+              <w:left w:val="single" w:sz="4" w:color="D9D9D9"/>
+              <w:right w:val="single" w:sz="4" w:color="D9D9D9"/>
+            </w:tcBorders>
           </w:tcPr>
           <w:p>
             <w:pPr>
-              <w:spacing w:after="100"/>
+              <w:spacing w:after="40"/>
             </w:pPr>
             <w:r>
               <w:rPr>
+                <w:color w:val="000000"/>
                 <w:sz w:val="19"/>
               </w:rPr>
               <w:t>Requirement</w:t>
@@ -1973,13 +3214,28 @@
         <w:tc>
           <w:tcPr>
             <w:tcW w:type="dxa" w:w="7632"/>
+            <w:vAlign w:val="center"/>
+            <w:shd w:fill="DDEBF7"/>
+            <w:tcMar>
+              <w:top w:w="70" w:type="dxa"/>
+              <w:bottom w:w="70" w:type="dxa"/>
+              <w:left w:w="70" w:type="dxa"/>
+              <w:right w:w="70" w:type="dxa"/>
+            </w:tcMar>
+            <w:tcBorders>
+              <w:top w:val="single" w:sz="4" w:color="D9D9D9"/>
+              <w:bottom w:val="single" w:sz="4" w:color="D9D9D9"/>
+              <w:left w:val="single" w:sz="4" w:color="D9D9D9"/>
+              <w:right w:val="single" w:sz="4" w:color="D9D9D9"/>
+            </w:tcBorders>
           </w:tcPr>
           <w:p>
             <w:pPr>
-              <w:spacing w:after="100"/>
+              <w:spacing w:after="40"/>
             </w:pPr>
             <w:r>
               <w:rPr>
+                <w:color w:val="000000"/>
                 <w:sz w:val="19"/>
               </w:rPr>
               <w:t>Evidence and remaining gate</w:t>
@@ -1994,13 +3250,28 @@
         <w:tc>
           <w:tcPr>
             <w:tcW w:type="dxa" w:w="2304"/>
+            <w:vAlign w:val="center"/>
+            <w:shd w:fill="FFFFFF"/>
+            <w:tcMar>
+              <w:top w:w="70" w:type="dxa"/>
+              <w:bottom w:w="70" w:type="dxa"/>
+              <w:left w:w="70" w:type="dxa"/>
+              <w:right w:w="70" w:type="dxa"/>
+            </w:tcMar>
+            <w:tcBorders>
+              <w:top w:val="single" w:sz="4" w:color="D9D9D9"/>
+              <w:bottom w:val="single" w:sz="4" w:color="D9D9D9"/>
+              <w:left w:val="single" w:sz="4" w:color="D9D9D9"/>
+              <w:right w:val="single" w:sz="4" w:color="D9D9D9"/>
+            </w:tcBorders>
           </w:tcPr>
           <w:p>
             <w:pPr>
-              <w:spacing w:after="100"/>
+              <w:spacing w:after="40"/>
             </w:pPr>
             <w:r>
               <w:rPr>
+                <w:color w:val="000000"/>
                 <w:sz w:val="19"/>
               </w:rPr>
               <w:t>Account and first project</w:t>
@@ -2010,16 +3281,30 @@
         <w:tc>
           <w:tcPr>
             <w:tcW w:type="dxa" w:w="7632"/>
+            <w:vAlign w:val="center"/>
+            <w:shd w:fill="FFFFFF"/>
+            <w:tcMar>
+              <w:top w:w="70" w:type="dxa"/>
+              <w:bottom w:w="70" w:type="dxa"/>
+              <w:left w:w="70" w:type="dxa"/>
+              <w:right w:w="70" w:type="dxa"/>
+            </w:tcMar>
+            <w:tcBorders>
+              <w:top w:val="single" w:sz="4" w:color="D9D9D9"/>
+              <w:bottom w:val="single" w:sz="4" w:color="D9D9D9"/>
+              <w:left w:val="single" w:sz="4" w:color="D9D9D9"/>
+              <w:right w:val="single" w:sz="4" w:color="D9D9D9"/>
+            </w:tcBorders>
           </w:tcPr>
           <w:p>
             <w:pPr>
-              <w:spacing w:after="100"/>
+              <w:spacing w:after="40"/>
             </w:pPr>
             <w:r>
               <w:rPr>
-                <w:sz w:val="19"/>
+                <w:color w:val="000000"/>
               </w:rPr>
-              <w:t>Welcome and session/ownership tests; live Muse handoff. Still needs human challenge and native synced-passkey enrollment/recovery on real devices.</w:t>
+              <w:t>Persisted question checkpoints, private pictures and single-project completion verified. One-call Muse first draft and browser reload verified locally. Human challenge and synced passkeys still need real devices.</w:t>
             </w:r>
           </w:p>
         </w:tc>
@@ -2031,13 +3316,28 @@
         <w:tc>
           <w:tcPr>
             <w:tcW w:type="dxa" w:w="2304"/>
+            <w:vAlign w:val="center"/>
+            <w:shd w:fill="FFFFFF"/>
+            <w:tcMar>
+              <w:top w:w="70" w:type="dxa"/>
+              <w:bottom w:w="70" w:type="dxa"/>
+              <w:left w:w="70" w:type="dxa"/>
+              <w:right w:w="70" w:type="dxa"/>
+            </w:tcMar>
+            <w:tcBorders>
+              <w:top w:val="single" w:sz="4" w:color="D9D9D9"/>
+              <w:bottom w:val="single" w:sz="4" w:color="D9D9D9"/>
+              <w:left w:val="single" w:sz="4" w:color="D9D9D9"/>
+              <w:right w:val="single" w:sz="4" w:color="D9D9D9"/>
+            </w:tcBorders>
           </w:tcPr>
           <w:p>
             <w:pPr>
-              <w:spacing w:after="100"/>
+              <w:spacing w:after="40"/>
             </w:pPr>
             <w:r>
               <w:rPr>
+                <w:color w:val="000000"/>
                 <w:sz w:val="19"/>
               </w:rPr>
               <w:t>Website lifecycle</w:t>
@@ -2047,13 +3347,28 @@
         <w:tc>
           <w:tcPr>
             <w:tcW w:type="dxa" w:w="7632"/>
+            <w:vAlign w:val="center"/>
+            <w:shd w:fill="FFFFFF"/>
+            <w:tcMar>
+              <w:top w:w="70" w:type="dxa"/>
+              <w:bottom w:w="70" w:type="dxa"/>
+              <w:left w:w="70" w:type="dxa"/>
+              <w:right w:w="70" w:type="dxa"/>
+            </w:tcMar>
+            <w:tcBorders>
+              <w:top w:val="single" w:sz="4" w:color="D9D9D9"/>
+              <w:bottom w:val="single" w:sz="4" w:color="D9D9D9"/>
+              <w:left w:val="single" w:sz="4" w:color="D9D9D9"/>
+              <w:right w:val="single" w:sz="4" w:color="D9D9D9"/>
+            </w:tcBorders>
           </w:tcPr>
           <w:p>
             <w:pPr>
-              <w:spacing w:after="100"/>
+              <w:spacing w:after="40"/>
             </w:pPr>
             <w:r>
               <w:rPr>
+                <w:color w:val="000000"/>
                 <w:sz w:val="19"/>
               </w:rPr>
               <w:t>Connected local handlers verify preview/export, confirmation replay, replacement, restore and unpublish. Keep real device and full workload acceptance separate.</w:t>
@@ -2068,13 +3383,28 @@
         <w:tc>
           <w:tcPr>
             <w:tcW w:type="dxa" w:w="2304"/>
+            <w:vAlign w:val="center"/>
+            <w:shd w:fill="FFFFFF"/>
+            <w:tcMar>
+              <w:top w:w="70" w:type="dxa"/>
+              <w:bottom w:w="70" w:type="dxa"/>
+              <w:left w:w="70" w:type="dxa"/>
+              <w:right w:w="70" w:type="dxa"/>
+            </w:tcMar>
+            <w:tcBorders>
+              <w:top w:val="single" w:sz="4" w:color="D9D9D9"/>
+              <w:bottom w:val="single" w:sz="4" w:color="D9D9D9"/>
+              <w:left w:val="single" w:sz="4" w:color="D9D9D9"/>
+              <w:right w:val="single" w:sz="4" w:color="D9D9D9"/>
+            </w:tcBorders>
           </w:tcPr>
           <w:p>
             <w:pPr>
-              <w:spacing w:after="100"/>
+              <w:spacing w:after="40"/>
             </w:pPr>
             <w:r>
               <w:rPr>
+                <w:color w:val="000000"/>
                 <w:sz w:val="19"/>
               </w:rPr>
               <w:t>Images and applications</w:t>
@@ -2084,13 +3414,28 @@
         <w:tc>
           <w:tcPr>
             <w:tcW w:type="dxa" w:w="7632"/>
+            <w:vAlign w:val="center"/>
+            <w:shd w:fill="FFFFFF"/>
+            <w:tcMar>
+              <w:top w:w="70" w:type="dxa"/>
+              <w:bottom w:w="70" w:type="dxa"/>
+              <w:left w:w="70" w:type="dxa"/>
+              <w:right w:w="70" w:type="dxa"/>
+            </w:tcMar>
+            <w:tcBorders>
+              <w:top w:val="single" w:sz="4" w:color="D9D9D9"/>
+              <w:bottom w:val="single" w:sz="4" w:color="D9D9D9"/>
+              <w:left w:val="single" w:sz="4" w:color="D9D9D9"/>
+              <w:right w:val="single" w:sz="4" w:color="D9D9D9"/>
+            </w:tcBorders>
           </w:tcPr>
           <w:p>
             <w:pPr>
-              <w:spacing w:after="100"/>
+              <w:spacing w:after="40"/>
             </w:pPr>
             <w:r>
               <w:rPr>
+                <w:color w:val="000000"/>
                 <w:sz w:val="19"/>
               </w:rPr>
               <w:t>Bounded photo, QuickJS, visitor/data and review tests exist. Broader app coverage, general migrations and recovery remain open.</w:t>
@@ -2105,13 +3450,28 @@
         <w:tc>
           <w:tcPr>
             <w:tcW w:type="dxa" w:w="2304"/>
+            <w:vAlign w:val="center"/>
+            <w:shd w:fill="FFFFFF"/>
+            <w:tcMar>
+              <w:top w:w="70" w:type="dxa"/>
+              <w:bottom w:w="70" w:type="dxa"/>
+              <w:left w:w="70" w:type="dxa"/>
+              <w:right w:w="70" w:type="dxa"/>
+            </w:tcMar>
+            <w:tcBorders>
+              <w:top w:val="single" w:sz="4" w:color="D9D9D9"/>
+              <w:bottom w:val="single" w:sz="4" w:color="D9D9D9"/>
+              <w:left w:val="single" w:sz="4" w:color="D9D9D9"/>
+              <w:right w:val="single" w:sz="4" w:color="D9D9D9"/>
+            </w:tcBorders>
           </w:tcPr>
           <w:p>
             <w:pPr>
-              <w:spacing w:after="100"/>
+              <w:spacing w:after="40"/>
             </w:pPr>
             <w:r>
               <w:rPr>
+                <w:color w:val="000000"/>
                 <w:sz w:val="19"/>
               </w:rPr>
               <w:t>CMS and migration</w:t>
@@ -2121,16 +3481,30 @@
         <w:tc>
           <w:tcPr>
             <w:tcW w:type="dxa" w:w="7632"/>
+            <w:vAlign w:val="center"/>
+            <w:shd w:fill="FFFFFF"/>
+            <w:tcMar>
+              <w:top w:w="70" w:type="dxa"/>
+              <w:bottom w:w="70" w:type="dxa"/>
+              <w:left w:w="70" w:type="dxa"/>
+              <w:right w:w="70" w:type="dxa"/>
+            </w:tcMar>
+            <w:tcBorders>
+              <w:top w:val="single" w:sz="4" w:color="D9D9D9"/>
+              <w:bottom w:val="single" w:sz="4" w:color="D9D9D9"/>
+              <w:left w:val="single" w:sz="4" w:color="D9D9D9"/>
+              <w:right w:val="single" w:sz="4" w:color="D9D9D9"/>
+            </w:tcBorders>
           </w:tcPr>
           <w:p>
             <w:pPr>
-              <w:spacing w:after="100"/>
+              <w:spacing w:after="40"/>
             </w:pPr>
             <w:r>
               <w:rPr>
-                <w:sz w:val="19"/>
+                <w:color w:val="000000"/>
               </w:rPr>
-              <w:t>Connected native/local content, media and private WordPress import checks. First reviewed live tenant and full migration/media scope remain open.</w:t>
+              <w:t>Actual EmDash verifies resumable reviewed category/tag imports and content recovery. Chat exposes pending work. First live tenant, broader metadata/media migration and production disaster recovery remain open.</w:t>
             </w:r>
           </w:p>
         </w:tc>
@@ -2142,13 +3516,28 @@
         <w:tc>
           <w:tcPr>
             <w:tcW w:type="dxa" w:w="2304"/>
+            <w:vAlign w:val="center"/>
+            <w:shd w:fill="FFFFFF"/>
+            <w:tcMar>
+              <w:top w:w="70" w:type="dxa"/>
+              <w:bottom w:w="70" w:type="dxa"/>
+              <w:left w:w="70" w:type="dxa"/>
+              <w:right w:w="70" w:type="dxa"/>
+            </w:tcMar>
+            <w:tcBorders>
+              <w:top w:val="single" w:sz="4" w:color="D9D9D9"/>
+              <w:bottom w:val="single" w:sz="4" w:color="D9D9D9"/>
+              <w:left w:val="single" w:sz="4" w:color="D9D9D9"/>
+              <w:right w:val="single" w:sz="4" w:color="D9D9D9"/>
+            </w:tcBorders>
           </w:tcPr>
           <w:p>
             <w:pPr>
-              <w:spacing w:after="100"/>
+              <w:spacing w:after="40"/>
             </w:pPr>
             <w:r>
               <w:rPr>
+                <w:color w:val="000000"/>
                 <w:sz w:val="19"/>
               </w:rPr>
               <w:t>Domains and accounts</w:t>
@@ -2158,13 +3547,28 @@
         <w:tc>
           <w:tcPr>
             <w:tcW w:type="dxa" w:w="7632"/>
+            <w:vAlign w:val="center"/>
+            <w:shd w:fill="FFFFFF"/>
+            <w:tcMar>
+              <w:top w:w="70" w:type="dxa"/>
+              <w:bottom w:w="70" w:type="dxa"/>
+              <w:left w:w="70" w:type="dxa"/>
+              <w:right w:w="70" w:type="dxa"/>
+            </w:tcMar>
+            <w:tcBorders>
+              <w:top w:val="single" w:sz="4" w:color="D9D9D9"/>
+              <w:bottom w:val="single" w:sz="4" w:color="D9D9D9"/>
+              <w:left w:val="single" w:sz="4" w:color="D9D9D9"/>
+              <w:right w:val="single" w:sz="4" w:color="D9D9D9"/>
+            </w:tcBorders>
           </w:tcPr>
           <w:p>
             <w:pPr>
-              <w:spacing w:after="100"/>
+              <w:spacing w:after="40"/>
             </w:pPr>
             <w:r>
               <w:rPr>
+                <w:color w:val="000000"/>
                 <w:sz w:val="19"/>
               </w:rPr>
               <w:t>Proof and reviewed provider workflows implemented. Real customer consent, backup, origin/TLS/serving/disconnect acceptance require setup.</w:t>
@@ -2179,13 +3583,28 @@
         <w:tc>
           <w:tcPr>
             <w:tcW w:type="dxa" w:w="2304"/>
+            <w:vAlign w:val="center"/>
+            <w:shd w:fill="FFFFFF"/>
+            <w:tcMar>
+              <w:top w:w="70" w:type="dxa"/>
+              <w:bottom w:w="70" w:type="dxa"/>
+              <w:left w:w="70" w:type="dxa"/>
+              <w:right w:w="70" w:type="dxa"/>
+            </w:tcMar>
+            <w:tcBorders>
+              <w:top w:val="single" w:sz="4" w:color="D9D9D9"/>
+              <w:bottom w:val="single" w:sz="4" w:color="D9D9D9"/>
+              <w:left w:val="single" w:sz="4" w:color="D9D9D9"/>
+              <w:right w:val="single" w:sz="4" w:color="D9D9D9"/>
+            </w:tcBorders>
           </w:tcPr>
           <w:p>
             <w:pPr>
-              <w:spacing w:after="100"/>
+              <w:spacing w:after="40"/>
             </w:pPr>
             <w:r>
               <w:rPr>
+                <w:color w:val="000000"/>
                 <w:sz w:val="19"/>
               </w:rPr>
               <w:t>Commerce and routing</w:t>
@@ -2195,16 +3614,30 @@
         <w:tc>
           <w:tcPr>
             <w:tcW w:type="dxa" w:w="7632"/>
+            <w:vAlign w:val="center"/>
+            <w:shd w:fill="FFFFFF"/>
+            <w:tcMar>
+              <w:top w:w="70" w:type="dxa"/>
+              <w:bottom w:w="70" w:type="dxa"/>
+              <w:left w:w="70" w:type="dxa"/>
+              <w:right w:w="70" w:type="dxa"/>
+            </w:tcMar>
+            <w:tcBorders>
+              <w:top w:val="single" w:sz="4" w:color="D9D9D9"/>
+              <w:bottom w:val="single" w:sz="4" w:color="D9D9D9"/>
+              <w:left w:val="single" w:sz="4" w:color="D9D9D9"/>
+              <w:right w:val="single" w:sz="4" w:color="D9D9D9"/>
+            </w:tcBorders>
           </w:tcPr>
           <w:p>
             <w:pPr>
-              <w:spacing w:after="100"/>
+              <w:spacing w:after="40"/>
             </w:pPr>
             <w:r>
               <w:rPr>
-                <w:sz w:val="19"/>
+                <w:color w:val="000000"/>
               </w:rPr>
-              <w:t>Proposed catalogue, test ledgers, planner and premium reservation foundations. Payments, benefits, tariff funding and actual gateway dispatch remain inactive.</w:t>
+              <w:t>Catalogue, test ledgers, planner, transport, single dispatch and provider-header recovery foundations exist. Payments, benefits, funded tariffs, invoice reconciliation and live gateway routing remain inactive.</w:t>
             </w:r>
           </w:p>
         </w:tc>
@@ -2216,13 +3649,28 @@
         <w:tc>
           <w:tcPr>
             <w:tcW w:type="dxa" w:w="2304"/>
+            <w:vAlign w:val="center"/>
+            <w:shd w:fill="FFFFFF"/>
+            <w:tcMar>
+              <w:top w:w="70" w:type="dxa"/>
+              <w:bottom w:w="70" w:type="dxa"/>
+              <w:left w:w="70" w:type="dxa"/>
+              <w:right w:w="70" w:type="dxa"/>
+            </w:tcMar>
+            <w:tcBorders>
+              <w:top w:val="single" w:sz="4" w:color="D9D9D9"/>
+              <w:bottom w:val="single" w:sz="4" w:color="D9D9D9"/>
+              <w:left w:val="single" w:sz="4" w:color="D9D9D9"/>
+              <w:right w:val="single" w:sz="4" w:color="D9D9D9"/>
+            </w:tcBorders>
           </w:tcPr>
           <w:p>
             <w:pPr>
-              <w:spacing w:after="100"/>
+              <w:spacing w:after="40"/>
             </w:pPr>
             <w:r>
               <w:rPr>
+                <w:color w:val="000000"/>
                 <w:sz w:val="19"/>
               </w:rPr>
               <w:t>Fair use and operations</w:t>
@@ -2232,16 +3680,30 @@
         <w:tc>
           <w:tcPr>
             <w:tcW w:type="dxa" w:w="7632"/>
+            <w:vAlign w:val="center"/>
+            <w:shd w:fill="FFFFFF"/>
+            <w:tcMar>
+              <w:top w:w="70" w:type="dxa"/>
+              <w:bottom w:w="70" w:type="dxa"/>
+              <w:left w:w="70" w:type="dxa"/>
+              <w:right w:w="70" w:type="dxa"/>
+            </w:tcMar>
+            <w:tcBorders>
+              <w:top w:val="single" w:sz="4" w:color="D9D9D9"/>
+              <w:bottom w:val="single" w:sz="4" w:color="D9D9D9"/>
+              <w:left w:val="single" w:sz="4" w:color="D9D9D9"/>
+              <w:right w:val="single" w:sz="4" w:color="D9D9D9"/>
+            </w:tcBorders>
           </w:tcPr>
           <w:p>
             <w:pPr>
-              <w:spacing w:after="100"/>
+              <w:spacing w:after="40"/>
             </w:pPr>
             <w:r>
               <w:rPr>
-                <w:sz w:val="19"/>
+                <w:color w:val="000000"/>
               </w:rPr>
-              <w:t>Monitor observations deployed. Verified company economics, human review/appeals, retention, account lifecycle and disaster recovery remain unfinished.</w:t>
+              <w:t>Monitor deployed; aggregate finance comparison is operator-only and cannot enforce. Verified economics, customer review/appeals, retention, account lifecycle and production recovery remain unfinished.</w:t>
             </w:r>
           </w:p>
         </w:tc>
@@ -2257,12 +3719,15 @@
         <w:pStyle w:val="Heading2"/>
       </w:pPr>
       <w:r>
+        <w:rPr>
+          <w:color w:val="000000"/>
+        </w:rPr>
         <w:t>Evidence to reproduce</w:t>
       </w:r>
     </w:p>
     <w:p>
       <w:r>
-        <w:t>Focused scripts: pnpm test:onboarding-welcome; pnpm test:profile; pnpm test:customer-site-journey; pnpm test:domain-proof-removal; pnpm test:gateway-spend. The opt-in RUN_LIVE_MUSE=1 pnpm test:welcome-ai-live uses the owner-authorized subscription and synthetic disposable data. Inspect each script and its prerequisites before running it; these commands are not a substitute for the remaining live gates.</w:t>
+        <w:t>Focused scripts include pnpm test:onboarding-welcome, test:profile, test:welcome-first-draft, test:customer-site-journey, test:cms-mapped-import, test:cms-pending, test:fair-use-finance and test:gateway-inference. The opt-in RUN_LIVE_MUSE=1 pnpm test:welcome-ai-live uses the authorized subscription and disposable state. Feature documents record prior runs and their scope; this document update reran welcome and profile checks only, alongside read-only deployment inspection and document layout verification. Inspect each script and its prerequisites before use.</w:t>
       </w:r>
     </w:p>
     <w:p>
@@ -2270,12 +3735,15 @@
         <w:pStyle w:val="Heading2"/>
       </w:pPr>
       <w:r>
+        <w:rPr>
+          <w:color w:val="000000"/>
+        </w:rPr>
         <w:t>Detailed source contracts</w:t>
       </w:r>
     </w:p>
     <w:p>
       <w:r>
-        <w:t>docs/acceptance.md and docs/mvp.md preserve the requirement map. docs/onboarding.md records welcome and handoff evidence. docs/pricing-and-model-policy.md defines pricing, routing, credits and Monitor policy. docs/emdash.md covers CMS and migration. docs/app-data.md covers visitor applications. docs/shared-components.md and docs/jarvis-reuse.md cover safe reuse. docs/domains.md and docs/integrations cover domain and account boundaries.</w:t>
+        <w:t>docs/acceptance.md and docs/mvp.md preserve the requirement map. docs/onboarding.md records welcome and first-draft evidence. docs/pricing-and-model-policy.md and docs/ai-gateway-transport.md cover routing and credits. docs/company-finance-review.md defines operator finance input. docs/workspace-agent.md covers navigation and unfinished publishing work. docs/emdash.md covers CMS and imports; docs/app-data.md covers visitor applications. Shared components, Jarvis reuse, domains and integration contracts remain in their corresponding docs files.</w:t>
       </w:r>
     </w:p>
     <w:p>

</xml_diff>

<commit_message>
Reconcile feature documentation with source and test deployment
</commit_message>
<xml_diff>
--- a/docs/whumpo_mvp_design.docx
+++ b/docs/whumpo_mvp_design.docx
@@ -15,7 +15,7 @@
     </w:p>
     <w:p>
       <w:r>
-        <w:t>Version 0.7  |  September 30 2026  |  Private test platform</w:t>
+        <w:t>Version 0.8  |  September 30 2026  |  Private test platform</w:t>
       </w:r>
     </w:p>
     <w:p>
@@ -76,7 +76,7 @@
         <w:pStyle w:val="ListBullet"/>
       </w:pPr>
       <w:r>
-        <w:t>Paid launch assistance is unlimited standard site work under fair use. Monitor mode is the default. Premium access and infrastructure spending require separate consent. Stripe remains deferred.</w:t>
+        <w:t>Launch policy awaits owner resolution: earlier unlimited standard AI under fair use conflicts with the newer shared resource pool that meters agent work. Monitor mode is the default. Premium access and infrastructure spending require separate consent. Stripe remains deferred.</w:t>
       </w:r>
     </w:p>
     <w:p>
@@ -2116,8 +2116,14 @@
       </w:r>
     </w:p>
     <w:p>
+      <w:pPr/>
       <w:r>
-        <w:t>Explore currently has 50 monthly test units. One build unit is the ceiling of input tokens plus four times output tokens, divided by 1,000. Existing test-credit overage requires opt-in. The legacy $5 for 100 test-credit mechanic is not a dollar wallet or the future premium tariff. Standard paid-plan launch assistance is intended to be unlimited under fair use. Payment activation remains deferred because the owner has no Stripe account.</w:t>
+        <w:t>Shared capacity is modeled offline at 1,000 / 2,500 / 7,500 / 14,000 proposed Whumpo Units, retaining $17 / $30 / $79 / $139 monthly prices. A proposed $10 top-up adds 1,000 units. Conditional annual contribution margins are 61–66% at full consumption after modeled fees, domain allowance, contingency and an operating reserve. This is not net profit or enabled billing; actual completed-task economics and rollover liability require validation. See docs/resource-pool-economics.md.</w:t>
+      </w:r>
+    </w:p>
+    <w:p>
+      <w:r>
+        <w:t>Explore currently has 50 monthly test units. One build unit is the ceiling of input tokens plus four times output tokens, divided by 1,000. Existing test-credit overage requires opt-in. The legacy $5 for 100 test-credit mechanic is not a dollar wallet or the future premium tariff. The paid-plan standard-AI metering policy is unresolved; current test quotas do not settle that choice. Payment activation remains deferred because the owner has no Stripe account.</w:t>
       </w:r>
     </w:p>
     <w:p>
@@ -2811,7 +2817,7 @@
     </w:p>
     <w:p>
       <w:r>
-        <w:t>These thresholds are initial observation hypotheses, not enforced caps or validated economics. Active enforcement remains unimplemented. A private operator report now compares adjacent closed periods of earned revenue and seven expense categories; absent values remain unknown. Revenue within 5 percent, falling profit and a margin decline of at least 5 percentage points can suggest review. Inputs are operator-attested, never independently verified. The report cannot change Monitor mode or restrict a customer. Actual financial ingestion, reconciliation, individual review, notice, continued-misuse evidence and appeals remain open. The operator may retain Monitor despite outliers.</w:t>
+        <w:t>These thresholds are initial observation hypotheses, not enforced caps or validated economics. Active enforcement remains unimplemented. A private operator report now compares adjacent closed periods of earned revenue and seven expense categories; absent values remain unknown. Revenue within 5 percent, falling profit and a margin decline of at least 5 percentage points can suggest review. Inputs are operator-attested, never independently verified. The report cannot change Monitor mode or restrict a customer. Internal individual review records and an operator preview/apply CLI are implemented. Verified financial ingestion/reconciliation, delivered notices, continued-misuse evidence and appeals remain open. The operator may retain Monitor despite outliers.</w:t>
       </w:r>
     </w:p>
     <w:p>
@@ -2872,7 +2878,7 @@
     </w:p>
     <w:p>
       <w:r>
-        <w:t>Controlled visitor applications have scoped visitor accounts, sessions and data. Their authentication and public pages are separate from workspace identity. A deployed runtime is not permission to execute arbitrary generated source in the platform Worker. General application schemas, customer schedules, unrestricted dependencies and broader migration/rollback workflows still require implementation and acceptance.</w:t>
+        <w:t>Controlled visitor applications have scoped visitor accounts, sessions and data. Their authentication and public pages are separate from workspace identity. A deployed runtime is not permission to execute arbitrary generated source in the platform Worker. Bounded offline code/data upgrades, saved-program/document rollback, cancellation and Chat review controls are implemented and deployed. General application schemas, customer schedules, unrestricted dependencies, whole-infrastructure recovery and first live customer upgrade acceptance remain open.</w:t>
       </w:r>
     </w:p>
     <w:p>
@@ -2888,12 +2894,12 @@
     </w:p>
     <w:p>
       <w:r>
-        <w:t>The shared library contains platform-authored generic components with version, digest, license and provenance. The current pure backend helpers include line-total and text-statistics. Reuse creates a private exact copy for the owning project; it does not execute, test, publish or activate that copy automatically. Withdrawal stops new adoption without silently rewriting existing copies.</w:t>
+        <w:t>The shared library contains platform-authored generic components with version, digest, license and provenance. The current pure backend helpers include line-total, text-statistics and private-task-list. Reuse creates a private exact copy for the owning project; it does not execute, test, publish or activate that copy automatically. Withdrawal stops new adoption without silently rewriting existing copies.</w:t>
       </w:r>
     </w:p>
     <w:p>
       <w:r>
-        <w:t>Never populate shared snippets by harvesting private customer source, prompts, data or credentials. Future customer-code promotion requires explicit provenance and license review, sensitive-data screening, tenant-data removal, reproducible checks and controlled version/withdrawal behavior. Customize only the customer’s private copy. Jarvis reuse decisions are recorded in docs/jarvis-reuse.md.</w:t>
+        <w:t>Never populate shared snippets by harvesting private customer source, prompts, data or credentials. Exact-version nominations, explicit consent and terminal withdrawal are deployed. Private operator intake and integrity checks are implemented without source disclosure. Synthetic candidate creation, provenance/license approval, sensitive-data screening, reproducible checks and maintainer publication remain unfinished. Customize only the customer’s private copy. Jarvis reuse decisions are recorded in docs/jarvis-reuse.md.</w:t>
       </w:r>
     </w:p>
     <w:p>
@@ -2939,7 +2945,7 @@
     </w:p>
     <w:p>
       <w:r>
-        <w:t>EmDash 1.0.1 support includes isolated workload preparation, private post/page editing, excerpts, media, exact preview and publication reviews. WordPress exports retain private source bytes and produce explicit article imports. New reviews can include supported root categories and tags, with exact labels and slugs and a maximum of 20 terms. Unsupported hierarchy, translations, custom taxonomy or ambiguous assignments stop the mapping review. Media, themes, plugins and accounts are not imported.</w:t>
+        <w:t>EmDash 1.0.1 support includes isolated workload preparation, private post/page editing, excerpts, media, exact preview and publication reviews. WordPress exports retain private source bytes and produce explicit article imports. New reviews can include supported root categories and tags, with exact labels and slugs and a maximum of 20 terms. Unsupported hierarchy, translations, custom taxonomy or ambiguous assignments stop the mapping review. Owner-mapped image import is now implemented with connected native/browser acceptance. Arbitrary remote media fetching, themes, plugins and accounts are not imported.</w:t>
       </w:r>
     </w:p>
     <w:p>
@@ -3081,7 +3087,7 @@
         <w:pStyle w:val="ListBullet"/>
       </w:pPr>
       <w:r>
-        <w:t>Apply required migrations before dependent code. Build the authoritative frontend. Deploy the platform through tools/deploy-platform.mjs so registered CMS service bindings and deployment coordination are preserved. The full tools/deploy.mjs path also handles runtime, visitor and site services.</w:t>
+        <w:t>Apply required migrations before dependent code. Build the authoritative frontend. Deploy the platform through tools/deploy-platform.mjs so registered CMS service bindings and deployment coordination are preserved. The full tools/deploy.mjs path also handles runtime, visitor and site services, but currently applies all pending migrations; use reviewed individual migrations until the release-policy conflict is resolved.</w:t>
       </w:r>
     </w:p>
     <w:p>
@@ -3134,7 +3140,7 @@
     </w:p>
     <w:p>
       <w:r>
-        <w:t>Read-only inspection on September 30, 2026 confirmed platform version 2304496a-7c65-429c-a201-72254448b33e at 100 percent, Monitor mode and zero registered CMS instances. Recent applied migrations are 0074, 0077, 0078 and 0079; gateway migrations 0075 and 0076 remain inactive. Secret-name inspection confirms AI, Turnstile, password and Cloudflare OAuth/encryption configuration. GitHub and Stripe secret sets are absent. Configured OAuth does not prove customer consent or DNS acceptance. No credential values or customer content were printed or collected for this document.</w:t>
+        <w:t>Read-only inspection on September 30, 2026 confirmed platform version b21f6da7-9703-41bd-963b-bf5dd4665aa8 at 100 percent, Monitor mode and zero registered CMS instances. Migrations 0001 through 0093 are applied except Gateway migrations 0075 and 0076. The full-stack deploy script still applies every pending migration; this conflicts with the selective-release policy and awaits owner resolution. Use reviewed per-migration releases in the meantime. Secret-name inspection confirms AI, Turnstile, password and Cloudflare OAuth/encryption configuration. GitHub and Stripe secret sets are absent. Configured OAuth does not prove customer consent or DNS acceptance. No credential values or customer content were printed or collected for this document.</w:t>
       </w:r>
     </w:p>
     <w:p>
@@ -3436,9 +3442,8 @@
             <w:r>
               <w:rPr>
                 <w:color w:val="000000"/>
-                <w:sz w:val="19"/>
               </w:rPr>
-              <w:t>Bounded photo, QuickJS, visitor/data and review tests exist. Broader app coverage, general migrations and recovery remain open.</w:t>
+              <w:t>Bounded photo, QuickJS, visitor/data and review tests exist. Bounded offline upgrades and program/document rollback are implemented and deployed. Broader workloads, live customer acceptance and whole-infrastructure recovery remain open.</w:t>
             </w:r>
           </w:p>
         </w:tc>
@@ -3504,7 +3509,7 @@
               <w:rPr>
                 <w:color w:val="000000"/>
               </w:rPr>
-              <w:t>Actual EmDash verifies resumable reviewed category/tag imports and content recovery. Chat exposes pending work. First live tenant, broader metadata/media migration and production disaster recovery remain open.</w:t>
+              <w:t>Actual EmDash verifies resumable reviewed category/tag imports and content recovery. Chat exposes pending work. Bounded image/taxonomy import has connected local-native/browser acceptance. First live tenant, bulk and cross-export migration, and production disaster recovery remain open.</w:t>
             </w:r>
           </w:p>
         </w:tc>
@@ -3703,7 +3708,7 @@
               <w:rPr>
                 <w:color w:val="000000"/>
               </w:rPr>
-              <w:t>Monitor deployed; aggregate finance comparison is operator-only and cannot enforce. Verified economics, customer review/appeals, retention, account lifecycle and production recovery remain unfinished.</w:t>
+              <w:t>Monitor deployed; aggregate finance comparison is operator-only and cannot enforce. Internal review records and CLI are implemented. Verified economics, delivered notices/appeals, retention, account lifecycle and production recovery remain unfinished.</w:t>
             </w:r>
           </w:p>
         </w:tc>
@@ -3727,7 +3732,7 @@
     </w:p>
     <w:p>
       <w:r>
-        <w:t>Focused scripts include pnpm test:onboarding-welcome, test:profile, test:welcome-first-draft, test:customer-site-journey, test:cms-mapped-import, test:cms-pending, test:fair-use-finance and test:gateway-inference. The opt-in RUN_LIVE_MUSE=1 pnpm test:welcome-ai-live uses the authorized subscription and disposable state. Feature documents record prior runs and their scope; this document update reran welcome and profile checks only, alongside read-only deployment inspection and document layout verification. Inspect each script and its prerequisites before use.</w:t>
+        <w:t>Focused scripts include pnpm test:onboarding-welcome, test:profile, test:welcome-first-draft, test:customer-site-journey, test:cms-mapped-import, test:cms-pending, test:fair-use-finance and test:gateway-inference. The opt-in RUN_LIVE_MUSE=1 pnpm test:welcome-ai-live uses the authorized subscription and disposable state. Feature documents record prior runs and their scope; this documentation-only update checked source references, script names and current deployment/migration state, and rendered every document page. It did not rerun application regression suites. Inspect each script and its prerequisites before use.</w:t>
       </w:r>
     </w:p>
     <w:p>
@@ -3748,7 +3753,7 @@
     </w:p>
     <w:p>
       <w:r>
-        <w:t>Prioritize first reviewed live CMS acceptance and provider setup when credentials/resources are available; continue independent application, recovery and economics work. Before API-funded beta, verify provider rates and routing quality, funding/consent and cost reconciliation. Finish physical-device and full customer journeys before declaring MVP completion.</w:t>
+        <w:t>Prioritize first reviewed live CMS acceptance and provider setup when credentials/resources are available; continue independent application, recovery and economics work. Before API-funded beta, verify provider rates and routing quality, funding/consent and cost reconciliation. Finish physical-device and full customer journeys before declaring MVP completion. The September 30 docs/code reconciliation in docs/docs-code-sync.md lists completed features and unresolved policy conflicts. Original and v0.5 Word documents remain historical inputs. Local enhanced owner-recovery changes remain undeployed.</w:t>
       </w:r>
     </w:p>
     <w:sectPr>

</xml_diff>

<commit_message>
Resolve fair-use policy and apply remaining test migrations
</commit_message>
<xml_diff>
--- a/docs/whumpo_mvp_design.docx
+++ b/docs/whumpo_mvp_design.docx
@@ -15,7 +15,7 @@
     </w:p>
     <w:p>
       <w:r>
-        <w:t>Version 0.8  |  September 30 2026  |  Private test platform</w:t>
+        <w:t>Version 0.9  |  September 30 2026  |  Private test platform</w:t>
       </w:r>
     </w:p>
     <w:p>
@@ -76,7 +76,7 @@
         <w:pStyle w:val="ListBullet"/>
       </w:pPr>
       <w:r>
-        <w:t>Launch policy awaits owner resolution: earlier unlimited standard AI under fair use conflicts with the newer shared resource pool that meters agent work. Monitor mode is the default. Premium access and infrastructure spending require separate consent. Stripe remains deferred.</w:t>
+        <w:t>Owner decision: standard AI stays unlimited under fair use as much as possible. Advanced-model work consumes explicitly approved credits; ordinary assistance does not draw from the infrastructure pool. Monitor mode is the default. Premium access and infrastructure spending require separate consent. Stripe remains deferred.</w:t>
       </w:r>
     </w:p>
     <w:p>
@@ -1071,7 +1071,7 @@
     </w:p>
     <w:p>
       <w:r>
-        <w:t>The route planner, durable spending reservations, OpenAI-compatible gateway transport and single-dispatch service are implemented and locally tested. Saved answers and bounded provider header identifiers support recovery. They are not wired into live Chat or a funded route. Header evidence is not a billable usage receipt. Migrations 0075 and 0076 remain unapplied remotely. Verified rates, funding, consent, invoice reconciliation and live gateway acceptance are still required. Opus, Sol, Astra and Fable remain future candidate names, not verified API identifiers.</w:t>
+        <w:t>The route planner, durable spending reservations, OpenAI-compatible gateway transport and single-dispatch service are implemented and locally tested. Saved answers and bounded provider header identifiers support recovery. They are not wired into live Chat or a funded route. Header evidence is not a billable usage receipt. Migrations 0075 and 0076 were applied September 30; both receipt tables were verified empty. Verified rates, funding, consent, invoice reconciliation and live gateway acceptance are still required. Opus, Sol, Astra and Fable remain future candidate names, not verified API identifiers.</w:t>
       </w:r>
     </w:p>
     <w:p>
@@ -2118,12 +2118,12 @@
     <w:p>
       <w:pPr/>
       <w:r>
-        <w:t>Shared capacity is modeled offline at 1,000 / 2,500 / 7,500 / 14,000 proposed Whumpo Units, retaining $17 / $30 / $79 / $139 monthly prices. A proposed $10 top-up adds 1,000 units. Conditional annual contribution margins are 61–66% at full consumption after modeled fees, domain allowance, contingency and an operating reserve. This is not net profit or enabled billing; actual completed-task economics and rollover liability require validation. See docs/resource-pool-economics.md.</w:t>
+        <w:t>Shared capacity is modeled offline at 1,000 / 2,500 / 7,500 / 14,000 proposed Whumpo Units, retaining $17 / $30 / $79 / $139 monthly prices. A proposed $10 top-up adds 1,000 units. Before standard AI expense, conditional annual contribution margins are 61–66% at full consumption after modeled fees, domain allowance, contingency and an operating reserve. At $5 monthly standard-AI expense plus contingency, annual margins are about 19%, 38%, 57% and 59%. Standard AI has zero customer-unit debits; its uncapped cost requires company-wide monitoring. This is not net profit or enabled billing; actual completed-task economics and rollover liability require validation. See docs/resource-pool-economics.md.</w:t>
       </w:r>
     </w:p>
     <w:p>
       <w:r>
-        <w:t>Explore currently has 50 monthly test units. One build unit is the ceiling of input tokens plus four times output tokens, divided by 1,000. Existing test-credit overage requires opt-in. The legacy $5 for 100 test-credit mechanic is not a dollar wallet or the future premium tariff. The paid-plan standard-AI metering policy is unresolved; current test quotas do not settle that choice. Payment activation remains deferred because the owner has no Stripe account.</w:t>
+        <w:t>Explore currently has 50 monthly test units. One build unit is the ceiling of input tokens plus four times output tokens, divided by 1,000. Existing test-credit overage requires opt-in. The legacy $5 for 100 test-credit mechanic is not a dollar wallet or the future premium tariff. Paid-launch standard AI remains unlimited under fair use; advanced models consume approved credits. Current test quotas are not the launch allowance. Payment activation remains deferred because the owner has no Stripe account.</w:t>
       </w:r>
     </w:p>
     <w:p>
@@ -3087,7 +3087,7 @@
         <w:pStyle w:val="ListBullet"/>
       </w:pPr>
       <w:r>
-        <w:t>Apply required migrations before dependent code. Build the authoritative frontend. Deploy the platform through tools/deploy-platform.mjs so registered CMS service bindings and deployment coordination are preserved. The full tools/deploy.mjs path also handles runtime, visitor and site services, but currently applies all pending migrations; use reviewed individual migrations until the release-policy conflict is resolved.</w:t>
+        <w:t>Apply required migrations before dependent code. Build the authoritative frontend. Deploy the platform through tools/deploy-platform.mjs so registered CMS service bindings and deployment coordination are preserved. The full tools/deploy.mjs path also handles runtime, visitor and site services, and applies all pending migrations as explicitly authorized for this private test environment. Schema application alone does not enable a provider or paid service.</w:t>
       </w:r>
     </w:p>
     <w:p>
@@ -3140,7 +3140,7 @@
     </w:p>
     <w:p>
       <w:r>
-        <w:t>Read-only inspection on September 30, 2026 confirmed platform version b21f6da7-9703-41bd-963b-bf5dd4665aa8 at 100 percent, Monitor mode and zero registered CMS instances. Migrations 0001 through 0093 are applied except Gateway migrations 0075 and 0076. The full-stack deploy script still applies every pending migration; this conflicts with the selective-release policy and awaits owner resolution. Use reviewed per-migration releases in the meantime. Secret-name inspection confirms AI, Turnstile, password and Cloudflare OAuth/encryption configuration. GitHub and Stripe secret sets are absent. Configured OAuth does not prove customer consent or DNS acceptance. No credential values or customer content were printed or collected for this document.</w:t>
+        <w:t>Read-only inspection on September 30, 2026 confirmed platform version b21f6da7-9703-41bd-963b-bf5dd4665aa8 at 100 percent, Monitor mode and zero registered CMS instances. Subsequent 14:21 UTC readback confirmed all 93 migrations applied, including 0075/0076, under the owner-authorized all-pending test policy. Both new Gateway tables were empty. Worker versions and Muse routing were unchanged. Secret-name inspection confirms AI, Turnstile, password and Cloudflare OAuth/encryption configuration. GitHub and Stripe secret sets are absent. Configured OAuth does not prove customer consent or DNS acceptance. No credential values or customer content were printed or collected for this document.</w:t>
       </w:r>
     </w:p>
     <w:p>
@@ -3753,7 +3753,7 @@
     </w:p>
     <w:p>
       <w:r>
-        <w:t>Prioritize first reviewed live CMS acceptance and provider setup when credentials/resources are available; continue independent application, recovery and economics work. Before API-funded beta, verify provider rates and routing quality, funding/consent and cost reconciliation. Finish physical-device and full customer journeys before declaring MVP completion. The September 30 docs/code reconciliation in docs/docs-code-sync.md lists completed features and unresolved policy conflicts. Original and v0.5 Word documents remain historical inputs. Local enhanced owner-recovery changes remain undeployed.</w:t>
+        <w:t>Prioritize first reviewed live CMS acceptance and provider setup when credentials/resources are available; continue independent application, recovery and economics work. Before API-funded beta, verify provider rates and routing quality, funding/consent and cost reconciliation. Finish physical-device and full customer journeys before declaring MVP completion. The September 30 docs/code reconciliation in docs/docs-code-sync.md lists completed features and the owner’s resolved policy decisions. Original and v0.5 Word documents remain historical inputs. Local enhanced owner-recovery changes remain undeployed.</w:t>
       </w:r>
     </w:p>
     <w:sectPr>

</xml_diff>